<commit_message>
Promote approved ISO and PCI localized figures
</commit_message>
<xml_diff>
--- a/02-management-systems/ISO_IEC_27001_27002/Portugues_BR/ISO_IEC_27001_27002_Practical_Manager_and_Junior_Analyst_Manual_Portugues_BR_v1.0.docx
+++ b/02-management-systems/ISO_IEC_27001_27002/Portugues_BR/ISO_IEC_27001_27002_Practical_Manager_and_Junior_Analyst_Manual_Portugues_BR_v1.0.docx
@@ -2,32 +2,6 @@
 <file path=word/document.xml><?xml version="1.0" encoding="utf-8"?>
 <w:document xmlns:w="http://schemas.openxmlformats.org/wordprocessingml/2006/main" xmlns:m="http://schemas.openxmlformats.org/officeDocument/2006/math" xmlns:r="http://schemas.openxmlformats.org/officeDocument/2006/relationships" xmlns:o="urn:schemas-microsoft-com:office:office" xmlns:v="urn:schemas-microsoft-com:vml" xmlns:w10="urn:schemas-microsoft-com:office:word" xmlns:a="http://schemas.openxmlformats.org/drawingml/2006/main" xmlns:pic="http://schemas.openxmlformats.org/drawingml/2006/picture" xmlns:wp="http://schemas.openxmlformats.org/drawingml/2006/wordprocessingDrawing">
   <w:body>
-    <w:sdt>
-      <w:sdtPr>
-        <w:docPartObj>
-          <w:docPartGallery w:val="Table of Contents"/>
-          <w:docPartUnique/>
-        </w:docPartObj>
-      </w:sdtPr>
-      <w:sdtContent>
-        <w:p>
-          <w:pPr>
-            <w:pStyle w:val="TOCHeading"/>
-          </w:pPr>
-          <w:r>
-            <w:t xml:space="preserve">Table of Contents</w:t>
-          </w:r>
-        </w:p>
-        <w:p>
-          <w:r>
-            <w:fldChar w:fldCharType="begin" w:dirty="true"/>
-            <w:instrText xml:space="preserve">TOC \o "1-3" \h \z \u</w:instrText>
-            <w:fldChar w:fldCharType="separate"/>
-            <w:fldChar w:fldCharType="end"/>
-          </w:r>
-        </w:p>
-      </w:sdtContent>
-    </w:sdt>
     <w:p>
       <w:pPr>
         <w:pStyle w:val="BlockText"/>
@@ -1083,7 +1057,7 @@
     </w:p>
     <w:bookmarkEnd w:id="22"/>
     <w:bookmarkEnd w:id="23"/>
-    <w:bookmarkStart w:id="26" w:name="isoiec-27001-e-27002-fundações"/>
+    <w:bookmarkStart w:id="29" w:name="isoiec-27001-e-27002-fundações"/>
     <w:p>
       <w:pPr>
         <w:pStyle w:val="Heading1"/>
@@ -1106,8 +1080,58 @@
     </w:p>
     <w:p>
       <w:pPr>
-        <w:pStyle w:val="FirstParagraph"/>
-      </w:pPr>
+        <w:pStyle w:val="CaptionedFigure"/>
+      </w:pPr>
+      <w:r>
+        <w:drawing>
+          <wp:inline>
+            <wp:extent cx="5334000" cy="2945449"/>
+            <wp:effectExtent b="0" l="0" r="0" t="0"/>
+            <wp:docPr descr="Contexto e planejamento de unidade de risco, implementação, avaliação e melhoria." title="" id="25" name="Picture"/>
+            <a:graphic>
+              <a:graphicData uri="http://schemas.openxmlformats.org/drawingml/2006/picture">
+                <pic:pic>
+                  <pic:nvPicPr>
+                    <pic:cNvPr descr="media/image1.png" id="26" name="Picture"/>
+                    <pic:cNvPicPr>
+                      <a:picLocks noChangeArrowheads="1" noChangeAspect="1"/>
+                    </pic:cNvPicPr>
+                  </pic:nvPicPr>
+                  <pic:blipFill>
+                    <a:blip r:embed="rId24"/>
+                    <a:stretch>
+                      <a:fillRect/>
+                    </a:stretch>
+                  </pic:blipFill>
+                  <pic:spPr bwMode="auto">
+                    <a:xfrm>
+                      <a:off x="0" y="0"/>
+                      <a:ext cx="5334000" cy="2945449"/>
+                    </a:xfrm>
+                    <a:prstGeom prst="rect">
+                      <a:avLst/>
+                    </a:prstGeom>
+                    <a:noFill/>
+                    <a:ln w="9525">
+                      <a:noFill/>
+                      <a:headEnd/>
+                      <a:tailEnd/>
+                    </a:ln>
+                  </pic:spPr>
+                </pic:pic>
+              </a:graphicData>
+            </a:graphic>
+          </wp:inline>
+        </w:drawing>
+      </w:r>
+    </w:p>
+    <w:p>
+      <w:pPr>
+        <w:pStyle w:val="ImageCaption"/>
+      </w:pPr>
+      <w:r>
+        <w:t xml:space="preserve">Contexto e planejamento de unidade de risco, implementação, avaliação e melhoria.</w:t>
+      </w:r>
     </w:p>
     <w:p>
       <w:pPr>
@@ -1117,7 +1141,7 @@
         <w:t xml:space="preserve">Figura 1. Ciclo de melhoria contínua do ISMS</w:t>
       </w:r>
     </w:p>
-    <w:bookmarkStart w:id="25" w:name="documento-função-certificação"/>
+    <w:bookmarkStart w:id="28" w:name="documento-função-certificação"/>
     <w:p>
       <w:pPr>
         <w:pStyle w:val="Heading2"/>
@@ -1334,11 +1358,11 @@
         </w:numPr>
         <w:pStyle w:val="Heading2"/>
       </w:pPr>
-      <w:bookmarkStart w:id="24" w:name="X6cf7bf4031c4143229ada689888c56631ec5db9"/>
+      <w:bookmarkStart w:id="27" w:name="X6cf7bf4031c4143229ada689888c56631ec5db9"/>
       <w:r>
         <w:t xml:space="preserve">** Teste de escopo** ** Pergunta gerencial** ** Evidência**</w:t>
       </w:r>
-      <w:bookmarkEnd w:id="24"/>
+      <w:bookmarkEnd w:id="27"/>
     </w:p>
     <w:p>
       <w:pPr>
@@ -1375,9 +1399,9 @@
         <w:t xml:space="preserve">• Relevância climática • Os efeitos climáticos ou as expectativas das partes interessadas podem afetar a disponibilidade, fornecedores, instalações, pessoas ou obrigações? • Análise de contexto, decisão, ações quando relevante</w:t>
       </w:r>
     </w:p>
-    <w:bookmarkEnd w:id="25"/>
-    <w:bookmarkEnd w:id="26"/>
-    <w:bookmarkStart w:id="28" w:name="avaliação-de-risco-e-tratamento-de-risco"/>
+    <w:bookmarkEnd w:id="28"/>
+    <w:bookmarkEnd w:id="29"/>
+    <w:bookmarkStart w:id="34" w:name="avaliação-de-risco-e-tratamento-de-risco"/>
     <w:p>
       <w:pPr>
         <w:pStyle w:val="Heading1"/>
@@ -1400,8 +1424,58 @@
     </w:p>
     <w:p>
       <w:pPr>
-        <w:pStyle w:val="FirstParagraph"/>
-      </w:pPr>
+        <w:pStyle w:val="CaptionedFigure"/>
+      </w:pPr>
+      <w:r>
+        <w:drawing>
+          <wp:inline>
+            <wp:extent cx="5334000" cy="2945449"/>
+            <wp:effectExtent b="0" l="0" r="0" t="0"/>
+            <wp:docPr descr="Donos de risco avaliam cenários, tratamento e risco residual utilizando critérios definidos." title="" id="31" name="Picture"/>
+            <a:graphic>
+              <a:graphicData uri="http://schemas.openxmlformats.org/drawingml/2006/picture">
+                <pic:pic>
+                  <pic:nvPicPr>
+                    <pic:cNvPr descr="media/image2.png" id="32" name="Picture"/>
+                    <pic:cNvPicPr>
+                      <a:picLocks noChangeArrowheads="1" noChangeAspect="1"/>
+                    </pic:cNvPicPr>
+                  </pic:nvPicPr>
+                  <pic:blipFill>
+                    <a:blip r:embed="rId30"/>
+                    <a:stretch>
+                      <a:fillRect/>
+                    </a:stretch>
+                  </pic:blipFill>
+                  <pic:spPr bwMode="auto">
+                    <a:xfrm>
+                      <a:off x="0" y="0"/>
+                      <a:ext cx="5334000" cy="2945449"/>
+                    </a:xfrm>
+                    <a:prstGeom prst="rect">
+                      <a:avLst/>
+                    </a:prstGeom>
+                    <a:noFill/>
+                    <a:ln w="9525">
+                      <a:noFill/>
+                      <a:headEnd/>
+                      <a:tailEnd/>
+                    </a:ln>
+                  </pic:spPr>
+                </pic:pic>
+              </a:graphicData>
+            </a:graphic>
+          </wp:inline>
+        </w:drawing>
+      </w:r>
+    </w:p>
+    <w:p>
+      <w:pPr>
+        <w:pStyle w:val="ImageCaption"/>
+      </w:pPr>
+      <w:r>
+        <w:t xml:space="preserve">Donos de risco avaliam cenários, tratamento e risco residual utilizando critérios definidos.</w:t>
+      </w:r>
     </w:p>
     <w:p>
       <w:pPr>
@@ -1427,7 +1501,7 @@
         </w:numPr>
         <w:pStyle w:val="Heading2"/>
       </w:pPr>
-      <w:bookmarkStart w:id="27" w:name="campo-exemplo-de-conteúdo"/>
+      <w:bookmarkStart w:id="33" w:name="campo-exemplo-de-conteúdo"/>
       <w:r>
         <w:t xml:space="preserve">** Campo**</w:t>
       </w:r>
@@ -1441,7 +1515,7 @@
         </w:rPr>
         <w:t xml:space="preserve">Exemplo de conteúdo</w:t>
       </w:r>
-      <w:bookmarkEnd w:id="27"/>
+      <w:bookmarkEnd w:id="33"/>
     </w:p>
     <w:p>
       <w:pPr>
@@ -1515,8 +1589,8 @@
         <w:t xml:space="preserve">• Risco residual; reavaliar após o tratamento; obter aprovação explícita do proprietário</w:t>
       </w:r>
     </w:p>
-    <w:bookmarkEnd w:id="28"/>
-    <w:bookmarkStart w:id="30" w:name="declaração-de-aplicabilidade"/>
+    <w:bookmarkEnd w:id="34"/>
+    <w:bookmarkStart w:id="39" w:name="declaração-de-aplicabilidade"/>
     <w:p>
       <w:pPr>
         <w:pStyle w:val="Heading1"/>
@@ -1539,96 +1613,146 @@
     </w:p>
     <w:p>
       <w:pPr>
+        <w:pStyle w:val="CaptionedFigure"/>
+      </w:pPr>
+      <w:r>
+        <w:drawing>
+          <wp:inline>
+            <wp:extent cx="5334000" cy="2945449"/>
+            <wp:effectExtent b="0" l="0" r="0" t="0"/>
+            <wp:docPr descr="The SoA registra seleção de controle fundamentada e status de implementação." title="" id="36" name="Picture"/>
+            <a:graphic>
+              <a:graphicData uri="http://schemas.openxmlformats.org/drawingml/2006/picture">
+                <pic:pic>
+                  <pic:nvPicPr>
+                    <pic:cNvPr descr="media/image3.png" id="37" name="Picture"/>
+                    <pic:cNvPicPr>
+                      <a:picLocks noChangeArrowheads="1" noChangeAspect="1"/>
+                    </pic:cNvPicPr>
+                  </pic:nvPicPr>
+                  <pic:blipFill>
+                    <a:blip r:embed="rId35"/>
+                    <a:stretch>
+                      <a:fillRect/>
+                    </a:stretch>
+                  </pic:blipFill>
+                  <pic:spPr bwMode="auto">
+                    <a:xfrm>
+                      <a:off x="0" y="0"/>
+                      <a:ext cx="5334000" cy="2945449"/>
+                    </a:xfrm>
+                    <a:prstGeom prst="rect">
+                      <a:avLst/>
+                    </a:prstGeom>
+                    <a:noFill/>
+                    <a:ln w="9525">
+                      <a:noFill/>
+                      <a:headEnd/>
+                      <a:tailEnd/>
+                    </a:ln>
+                  </pic:spPr>
+                </pic:pic>
+              </a:graphicData>
+            </a:graphic>
+          </wp:inline>
+        </w:drawing>
+      </w:r>
+    </w:p>
+    <w:p>
+      <w:pPr>
+        <w:pStyle w:val="ImageCaption"/>
+      </w:pPr>
+      <w:r>
+        <w:t xml:space="preserve">The SoA registra seleção de controle fundamentada e status de implementação.</w:t>
+      </w:r>
+    </w:p>
+    <w:p>
+      <w:pPr>
+        <w:pStyle w:val="BodyText"/>
+      </w:pPr>
+      <w:r>
+        <w:t xml:space="preserve">Figura 3. Declaração de fluxo de trabalho de aplicabilidade</w:t>
+      </w:r>
+    </w:p>
+    <w:p>
+      <w:pPr>
+        <w:numPr>
+          <w:ilvl w:val="0"/>
+          <w:numId w:val="1010"/>
+        </w:numPr>
+      </w:pPr>
+      <w:r>
+        <w:t xml:space="preserve">Listar os controlos necessários para tratar os riscos identificados de segurança da informação e cumprir os requisitos legais, regulamentares, contratuais e comerciais.</w:t>
+      </w:r>
+    </w:p>
+    <w:p>
+      <w:pPr>
+        <w:numPr>
+          <w:ilvl w:val="0"/>
+          <w:numId w:val="1010"/>
+        </w:numPr>
+      </w:pPr>
+      <w:r>
+        <w:t xml:space="preserve">Compare os controlos seleccionados com o anexo A, pelo que os controlos de referência necessários não são ignorados.</w:t>
+      </w:r>
+    </w:p>
+    <w:p>
+      <w:pPr>
+        <w:numPr>
+          <w:ilvl w:val="0"/>
+          <w:numId w:val="1010"/>
+        </w:numPr>
+      </w:pPr>
+      <w:r>
+        <w:t xml:space="preserve">Registar se cada controlo do anexo A é aplicável e justificar a inclusão ou exclusão.</w:t>
+      </w:r>
+    </w:p>
+    <w:p>
+      <w:pPr>
+        <w:numPr>
+          <w:ilvl w:val="0"/>
+          <w:numId w:val="1010"/>
+        </w:numPr>
+      </w:pPr>
+      <w:r>
+        <w:t xml:space="preserve">Registar claramente o estado de execução e mantê-lo em conformidade com o plano de tratamento de risco e as provas operacionais.</w:t>
+      </w:r>
+    </w:p>
+    <w:p>
+      <w:pPr>
+        <w:numPr>
+          <w:ilvl w:val="0"/>
+          <w:numId w:val="1010"/>
+        </w:numPr>
+      </w:pPr>
+      <w:r>
+        <w:t xml:space="preserve">Inclua controlos específicos da organização quando o anexo A não abordar totalmente um risco.</w:t>
+      </w:r>
+    </w:p>
+    <w:p>
+      <w:pPr>
+        <w:numPr>
+          <w:ilvl w:val="0"/>
+          <w:numId w:val="1010"/>
+        </w:numPr>
+      </w:pPr>
+      <w:r>
+        <w:t xml:space="preserve">Controlar o SoA como informação documentada e atualizá-lo após mudanças de risco, escopo, legal, fornecedor, tecnologia ou controle de material.</w:t>
+      </w:r>
+    </w:p>
+    <w:bookmarkStart w:id="38" w:name="section"/>
+    <w:p>
+      <w:pPr>
+        <w:pStyle w:val="Heading2"/>
+      </w:pPr>
+      <w:r>
+        <w:t xml:space="preserve">* * * * * * * * * * * * * * * * * * * * * * * * * * * * * * * * * * * * * * * * * * * * * * * * * * * * * * * * * * * * * * * * * * * * * * * * * * * * * * * * * * * * * * * * * * * * * * * * * * * * * * * * * * * * * * * * * * * * * * * * * * * * * * * * * * * * * * * * * * * * * * * * * * * * * * * * * * * * * * * * * * * * * * * * * * * * * * * * * * * * * * * * * * * * * * * * * * * * * * * * * * * * * * * * * * * * * * * * * * * * * * * * * * * * * * * * * * * * * * * * * * * * * * * * * * * * * * * *</w:t>
+      </w:r>
+    </w:p>
+    <w:p>
+      <w:pPr>
         <w:pStyle w:val="FirstParagraph"/>
       </w:pPr>
-    </w:p>
-    <w:p>
-      <w:pPr>
-        <w:pStyle w:val="BodyText"/>
-      </w:pPr>
-      <w:r>
-        <w:t xml:space="preserve">Figura 3. Declaração de fluxo de trabalho de aplicabilidade</w:t>
-      </w:r>
-    </w:p>
-    <w:p>
-      <w:pPr>
-        <w:numPr>
-          <w:ilvl w:val="0"/>
-          <w:numId w:val="1010"/>
-        </w:numPr>
-      </w:pPr>
-      <w:r>
-        <w:t xml:space="preserve">Listar os controlos necessários para tratar os riscos identificados de segurança da informação e cumprir os requisitos legais, regulamentares, contratuais e comerciais.</w:t>
-      </w:r>
-    </w:p>
-    <w:p>
-      <w:pPr>
-        <w:numPr>
-          <w:ilvl w:val="0"/>
-          <w:numId w:val="1010"/>
-        </w:numPr>
-      </w:pPr>
-      <w:r>
-        <w:t xml:space="preserve">Compare os controlos seleccionados com o anexo A, pelo que os controlos de referência necessários não são ignorados.</w:t>
-      </w:r>
-    </w:p>
-    <w:p>
-      <w:pPr>
-        <w:numPr>
-          <w:ilvl w:val="0"/>
-          <w:numId w:val="1010"/>
-        </w:numPr>
-      </w:pPr>
-      <w:r>
-        <w:t xml:space="preserve">Registar se cada controlo do anexo A é aplicável e justificar a inclusão ou exclusão.</w:t>
-      </w:r>
-    </w:p>
-    <w:p>
-      <w:pPr>
-        <w:numPr>
-          <w:ilvl w:val="0"/>
-          <w:numId w:val="1010"/>
-        </w:numPr>
-      </w:pPr>
-      <w:r>
-        <w:t xml:space="preserve">Registar claramente o estado de execução e mantê-lo em conformidade com o plano de tratamento de risco e as provas operacionais.</w:t>
-      </w:r>
-    </w:p>
-    <w:p>
-      <w:pPr>
-        <w:numPr>
-          <w:ilvl w:val="0"/>
-          <w:numId w:val="1010"/>
-        </w:numPr>
-      </w:pPr>
-      <w:r>
-        <w:t xml:space="preserve">Inclua controlos específicos da organização quando o anexo A não abordar totalmente um risco.</w:t>
-      </w:r>
-    </w:p>
-    <w:p>
-      <w:pPr>
-        <w:numPr>
-          <w:ilvl w:val="0"/>
-          <w:numId w:val="1010"/>
-        </w:numPr>
-      </w:pPr>
-      <w:r>
-        <w:t xml:space="preserve">Controlar o SoA como informação documentada e atualizá-lo após mudanças de risco, escopo, legal, fornecedor, tecnologia ou controle de material.</w:t>
-      </w:r>
-    </w:p>
-    <w:bookmarkStart w:id="29" w:name="section"/>
-    <w:p>
-      <w:pPr>
-        <w:pStyle w:val="Heading2"/>
-      </w:pPr>
-      <w:r>
-        <w:t xml:space="preserve">* * * * * * * * * * * * * * * * * * * * * * * * * * * * * * * * * * * * * * * * * * * * * * * * * * * * * * * * * * * * * * * * * * * * * * * * * * * * * * * * * * * * * * * * * * * * * * * * * * * * * * * * * * * * * * * * * * * * * * * * * * * * * * * * * * * * * * * * * * * * * * * * * * * * * * * * * * * * * * * * * * * * * * * * * * * * * * * * * * * * * * * * * * * * * * * * * * * * * * * * * * * * * * * * * * * * * * * * * * * * * * * * * * * * * * * * * * * * * * * * * * * * * * * * * * * * * * * *</w:t>
-      </w:r>
-    </w:p>
-    <w:p>
-      <w:pPr>
-        <w:pStyle w:val="FirstParagraph"/>
-      </w:pPr>
       <w:r>
         <w:t xml:space="preserve">Exemplo 8.15 de loging Sim Necessário para detecção, investigação e obrigações</w:t>
       </w:r>
@@ -1651,9 +1775,9 @@
         <w:t xml:space="preserve">Exclusão de exemplo A tecnologia ou o cenário descrito estão ausentes do âmbito controlado</w:t>
       </w:r>
     </w:p>
-    <w:bookmarkEnd w:id="29"/>
-    <w:bookmarkEnd w:id="30"/>
-    <w:bookmarkStart w:id="32" w:name="documentação-e-evidência"/>
+    <w:bookmarkEnd w:id="38"/>
+    <w:bookmarkEnd w:id="39"/>
+    <w:bookmarkStart w:id="44" w:name="documentação-e-evidência"/>
     <w:p>
       <w:pPr>
         <w:pStyle w:val="Heading1"/>
@@ -1676,8 +1800,58 @@
     </w:p>
     <w:p>
       <w:pPr>
-        <w:pStyle w:val="FirstParagraph"/>
-      </w:pPr>
+        <w:pStyle w:val="CaptionedFigure"/>
+      </w:pPr>
+      <w:r>
+        <w:drawing>
+          <wp:inline>
+            <wp:extent cx="5334000" cy="2854157"/>
+            <wp:effectExtent b="0" l="0" r="0" t="0"/>
+            <wp:docPr descr="A evidência deve sustentar o desenho, a operação, as exceções, a correção e o reteste." title="" id="41" name="Picture"/>
+            <a:graphic>
+              <a:graphicData uri="http://schemas.openxmlformats.org/drawingml/2006/picture">
+                <pic:pic>
+                  <pic:nvPicPr>
+                    <pic:cNvPr descr="media/image4.png" id="42" name="Picture"/>
+                    <pic:cNvPicPr>
+                      <a:picLocks noChangeArrowheads="1" noChangeAspect="1"/>
+                    </pic:cNvPicPr>
+                  </pic:nvPicPr>
+                  <pic:blipFill>
+                    <a:blip r:embed="rId40"/>
+                    <a:stretch>
+                      <a:fillRect/>
+                    </a:stretch>
+                  </pic:blipFill>
+                  <pic:spPr bwMode="auto">
+                    <a:xfrm>
+                      <a:off x="0" y="0"/>
+                      <a:ext cx="5334000" cy="2854157"/>
+                    </a:xfrm>
+                    <a:prstGeom prst="rect">
+                      <a:avLst/>
+                    </a:prstGeom>
+                    <a:noFill/>
+                    <a:ln w="9525">
+                      <a:noFill/>
+                      <a:headEnd/>
+                      <a:tailEnd/>
+                    </a:ln>
+                  </pic:spPr>
+                </pic:pic>
+              </a:graphicData>
+            </a:graphic>
+          </wp:inline>
+        </w:drawing>
+      </w:r>
+    </w:p>
+    <w:p>
+      <w:pPr>
+        <w:pStyle w:val="ImageCaption"/>
+      </w:pPr>
+      <w:r>
+        <w:t xml:space="preserve">A evidência deve sustentar o desenho, a operação, as exceções, a correção e o reteste.</w:t>
+      </w:r>
     </w:p>
     <w:p>
       <w:pPr>
@@ -1687,7 +1861,7 @@
         <w:t xml:space="preserve">Figura 4. Cadeia de exigência à evidência</w:t>
       </w:r>
     </w:p>
-    <w:bookmarkStart w:id="31" w:name="documento-ou-registo-purpose-controle"/>
+    <w:bookmarkStart w:id="43" w:name="documento-ou-registo-purpose-controle"/>
     <w:p>
       <w:pPr>
         <w:pStyle w:val="Heading2"/>
@@ -1782,9 +1956,9 @@
         <w:t xml:space="preserve">• Registros de ação corretiva • Mostra causa raiz e correção eficaz • Causa abordada, recorrência considerada, eficácia verificada</w:t>
       </w:r>
     </w:p>
-    <w:bookmarkEnd w:id="31"/>
-    <w:bookmarkEnd w:id="32"/>
-    <w:bookmarkStart w:id="34" w:name="cláusula-4-contexto-da-organização"/>
+    <w:bookmarkEnd w:id="43"/>
+    <w:bookmarkEnd w:id="44"/>
+    <w:bookmarkStart w:id="46" w:name="cláusula-4-contexto-da-organização"/>
     <w:p>
       <w:pPr>
         <w:pStyle w:val="Heading1"/>
@@ -1819,7 +1993,7 @@
         <w:t xml:space="preserve">.————————————————-</w:t>
       </w:r>
     </w:p>
-    <w:bookmarkStart w:id="33" w:name="X1c849def24eef0f33ad5f34d8e75ffca5136528"/>
+    <w:bookmarkStart w:id="45" w:name="X1c849def24eef0f33ad5f34d8e75ffca5136528"/>
     <w:p>
       <w:pPr>
         <w:pStyle w:val="Heading2"/>
@@ -1913,9 +2087,9 @@
         <w:t xml:space="preserve">O que é que se passa?</w:t>
       </w:r>
     </w:p>
-    <w:bookmarkEnd w:id="33"/>
-    <w:bookmarkEnd w:id="34"/>
-    <w:bookmarkStart w:id="36" w:name="cláusula-5-liderança"/>
+    <w:bookmarkEnd w:id="45"/>
+    <w:bookmarkEnd w:id="46"/>
+    <w:bookmarkStart w:id="48" w:name="cláusula-5-liderança"/>
     <w:p>
       <w:pPr>
         <w:pStyle w:val="Heading1"/>
@@ -1950,7 +2124,7 @@
         <w:t xml:space="preserve">.————————————————</w:t>
       </w:r>
     </w:p>
-    <w:bookmarkStart w:id="35" w:name="Xaa6479fe29681ab632e4ebd768efe1b358b9200"/>
+    <w:bookmarkStart w:id="47" w:name="Xaa6479fe29681ab632e4ebd768efe1b358b9200"/>
     <w:p>
       <w:pPr>
         <w:pStyle w:val="Heading2"/>
@@ -2024,9 +2198,9 @@
         <w:t xml:space="preserve">Use o texto oficial licenciado ISO/IEC 27001 para requisitos normativos exatos. Este manual parafraseia conceitos para a educação e não substitui o padrão.</w:t>
       </w:r>
     </w:p>
-    <w:bookmarkEnd w:id="35"/>
-    <w:bookmarkEnd w:id="36"/>
-    <w:bookmarkStart w:id="39" w:name="cláusula-6-planejamento"/>
+    <w:bookmarkEnd w:id="47"/>
+    <w:bookmarkEnd w:id="48"/>
+    <w:bookmarkStart w:id="51" w:name="cláusula-6-planejamento"/>
     <w:p>
       <w:pPr>
         <w:pStyle w:val="Heading1"/>
@@ -2047,7 +2221,7 @@
         <w:t xml:space="preserve">Requisitos em linguagem plana, foco de verificação e evidência de exemplo.*</w:t>
       </w:r>
     </w:p>
-    <w:bookmarkStart w:id="37" w:name="finalidade-da-clausa-planeamento"/>
+    <w:bookmarkStart w:id="49" w:name="finalidade-da-clausa-planeamento"/>
     <w:p>
       <w:pPr>
         <w:pStyle w:val="Heading2"/>
@@ -2056,8 +2230,8 @@
         <w:t xml:space="preserve">□ ** Finalidade da clausa: ** Planeamento</w:t>
       </w:r>
     </w:p>
-    <w:bookmarkEnd w:id="37"/>
-    <w:bookmarkStart w:id="38" w:name="X5764a8f9d95430a353ef6161bae8a526d8dd964"/>
+    <w:bookmarkEnd w:id="49"/>
+    <w:bookmarkStart w:id="50" w:name="X5764a8f9d95430a353ef6161bae8a526d8dd964"/>
     <w:p>
       <w:pPr>
         <w:pStyle w:val="Heading2"/>
@@ -2143,9 +2317,9 @@
         <w:t xml:space="preserve">Use o texto oficial licenciado ISO/IEC 27001 para requisitos normativos exatos. Este manual parafraseia conceitos para a educação e não substitui o padrão.</w:t>
       </w:r>
     </w:p>
-    <w:bookmarkEnd w:id="38"/>
-    <w:bookmarkEnd w:id="39"/>
-    <w:bookmarkStart w:id="42" w:name="cláusula-7-apoio"/>
+    <w:bookmarkEnd w:id="50"/>
+    <w:bookmarkEnd w:id="51"/>
+    <w:bookmarkStart w:id="54" w:name="cláusula-7-apoio"/>
     <w:p>
       <w:pPr>
         <w:pStyle w:val="Heading1"/>
@@ -2166,7 +2340,7 @@
         <w:t xml:space="preserve">Requisitos em linguagem plana, foco de verificação e evidência de exemplo.*</w:t>
       </w:r>
     </w:p>
-    <w:bookmarkStart w:id="40" w:name="finalidade-da-clausa-suporte"/>
+    <w:bookmarkStart w:id="52" w:name="finalidade-da-clausa-suporte"/>
     <w:p>
       <w:pPr>
         <w:pStyle w:val="Heading2"/>
@@ -2175,8 +2349,8 @@
         <w:t xml:space="preserve">□ ** Finalidade da clausa: ** Suporte</w:t>
       </w:r>
     </w:p>
-    <w:bookmarkEnd w:id="40"/>
-    <w:bookmarkStart w:id="41" w:name="X99c1588b6a405bab7c04ab8b0bd8fad50142806"/>
+    <w:bookmarkEnd w:id="52"/>
+    <w:bookmarkStart w:id="53" w:name="X99c1588b6a405bab7c04ab8b0bd8fad50142806"/>
     <w:p>
       <w:pPr>
         <w:pStyle w:val="Heading2"/>
@@ -2262,9 +2436,9 @@
         <w:t xml:space="preserve">Use o texto oficial licenciado ISO/IEC 27001 para requisitos normativos exatos. Este manual parafraseia conceitos para a educação e não substitui o padrão.</w:t>
       </w:r>
     </w:p>
-    <w:bookmarkEnd w:id="41"/>
-    <w:bookmarkEnd w:id="42"/>
-    <w:bookmarkStart w:id="45" w:name="cláusula-8-operação"/>
+    <w:bookmarkEnd w:id="53"/>
+    <w:bookmarkEnd w:id="54"/>
+    <w:bookmarkStart w:id="57" w:name="cláusula-8-operação"/>
     <w:p>
       <w:pPr>
         <w:pStyle w:val="Heading1"/>
@@ -2285,7 +2459,7 @@
         <w:t xml:space="preserve">Requisitos em linguagem plana, foco de verificação e evidência de exemplo.*</w:t>
       </w:r>
     </w:p>
-    <w:bookmarkStart w:id="43" w:name="finalidade-da-clausa-funcionamento"/>
+    <w:bookmarkStart w:id="55" w:name="finalidade-da-clausa-funcionamento"/>
     <w:p>
       <w:pPr>
         <w:pStyle w:val="Heading2"/>
@@ -2294,8 +2468,8 @@
         <w:t xml:space="preserve">□ ** Finalidade da clausa: ** Funcionamento</w:t>
       </w:r>
     </w:p>
-    <w:bookmarkEnd w:id="43"/>
-    <w:bookmarkStart w:id="44" w:name="X4807fe7596e81d95cd25c1b699c80f1de2d542c"/>
+    <w:bookmarkEnd w:id="55"/>
+    <w:bookmarkStart w:id="56" w:name="X4807fe7596e81d95cd25c1b699c80f1de2d542c"/>
     <w:p>
       <w:pPr>
         <w:pStyle w:val="Heading2"/>
@@ -2369,9 +2543,9 @@
         <w:t xml:space="preserve">Use o texto oficial licenciado ISO/IEC 27001 para requisitos normativos exatos. Este manual parafraseia conceitos para a educação e não substitui o padrão.</w:t>
       </w:r>
     </w:p>
-    <w:bookmarkEnd w:id="44"/>
-    <w:bookmarkEnd w:id="45"/>
-    <w:bookmarkStart w:id="48" w:name="cláusula-9-avaliação-do-desempenho"/>
+    <w:bookmarkEnd w:id="56"/>
+    <w:bookmarkEnd w:id="57"/>
+    <w:bookmarkStart w:id="63" w:name="cláusula-9-avaliação-do-desempenho"/>
     <w:p>
       <w:pPr>
         <w:pStyle w:val="Heading1"/>
@@ -2392,7 +2566,7 @@
         <w:t xml:space="preserve">Requisitos em linguagem plana, foco de verificação e evidência de exemplo.*</w:t>
       </w:r>
     </w:p>
-    <w:bookmarkStart w:id="46" w:name="X56294b004150b5312cf18f571d845f783d739fc"/>
+    <w:bookmarkStart w:id="58" w:name="X56294b004150b5312cf18f571d845f783d739fc"/>
     <w:p>
       <w:pPr>
         <w:pStyle w:val="Heading2"/>
@@ -2401,8 +2575,8 @@
         <w:t xml:space="preserve">□ ** Finalidade da clausa: ** Avaliação do desempenho</w:t>
       </w:r>
     </w:p>
-    <w:bookmarkEnd w:id="46"/>
-    <w:bookmarkStart w:id="47" w:name="X94d0fa55c795f02d2b3641f656fedad4b021328"/>
+    <w:bookmarkEnd w:id="58"/>
+    <w:bookmarkStart w:id="62" w:name="X94d0fa55c795f02d2b3641f656fedad4b021328"/>
     <w:p>
       <w:pPr>
         <w:pStyle w:val="Heading2"/>
@@ -2496,8 +2670,58 @@
     </w:p>
     <w:p>
       <w:pPr>
-        <w:pStyle w:val="BodyText"/>
-      </w:pPr>
+        <w:pStyle w:val="CaptionedFigure"/>
+      </w:pPr>
+      <w:r>
+        <w:drawing>
+          <wp:inline>
+            <wp:extent cx="5334000" cy="2887934"/>
+            <wp:effectExtent b="0" l="0" r="0" t="0"/>
+            <wp:docPr descr="Um programa de auditoria segue risco, independência, evidências, relatórios e acompanhamento verificado." title="" id="60" name="Picture"/>
+            <a:graphic>
+              <a:graphicData uri="http://schemas.openxmlformats.org/drawingml/2006/picture">
+                <pic:pic>
+                  <pic:nvPicPr>
+                    <pic:cNvPr descr="media/image5.png" id="61" name="Picture"/>
+                    <pic:cNvPicPr>
+                      <a:picLocks noChangeArrowheads="1" noChangeAspect="1"/>
+                    </pic:cNvPicPr>
+                  </pic:nvPicPr>
+                  <pic:blipFill>
+                    <a:blip r:embed="rId59"/>
+                    <a:stretch>
+                      <a:fillRect/>
+                    </a:stretch>
+                  </pic:blipFill>
+                  <pic:spPr bwMode="auto">
+                    <a:xfrm>
+                      <a:off x="0" y="0"/>
+                      <a:ext cx="5334000" cy="2887934"/>
+                    </a:xfrm>
+                    <a:prstGeom prst="rect">
+                      <a:avLst/>
+                    </a:prstGeom>
+                    <a:noFill/>
+                    <a:ln w="9525">
+                      <a:noFill/>
+                      <a:headEnd/>
+                      <a:tailEnd/>
+                    </a:ln>
+                  </pic:spPr>
+                </pic:pic>
+              </a:graphicData>
+            </a:graphic>
+          </wp:inline>
+        </w:drawing>
+      </w:r>
+    </w:p>
+    <w:p>
+      <w:pPr>
+        <w:pStyle w:val="ImageCaption"/>
+      </w:pPr>
+      <w:r>
+        <w:t xml:space="preserve">Um programa de auditoria segue risco, independência, evidências, relatórios e acompanhamento verificado.</w:t>
+      </w:r>
     </w:p>
     <w:p>
       <w:pPr>
@@ -2507,9 +2731,9 @@
         <w:t xml:space="preserve">Figura 5. Fluxo de trabalho de auditoria interna</w:t>
       </w:r>
     </w:p>
-    <w:bookmarkEnd w:id="47"/>
-    <w:bookmarkEnd w:id="48"/>
-    <w:bookmarkStart w:id="50" w:name="cláusula-10-melhoria"/>
+    <w:bookmarkEnd w:id="62"/>
+    <w:bookmarkEnd w:id="63"/>
+    <w:bookmarkStart w:id="68" w:name="cláusula-10-melhoria"/>
     <w:p>
       <w:pPr>
         <w:pStyle w:val="Heading1"/>
@@ -2544,7 +2768,7 @@
         <w:t xml:space="preserve">O que é que se passa?</w:t>
       </w:r>
     </w:p>
-    <w:bookmarkStart w:id="49" w:name="X0ddb8ff69d765fa40c38070237c501861aa15ee"/>
+    <w:bookmarkStart w:id="67" w:name="X0ddb8ff69d765fa40c38070237c501861aa15ee"/>
     <w:p>
       <w:pPr>
         <w:pStyle w:val="Heading2"/>
@@ -2614,8 +2838,58 @@
     </w:p>
     <w:p>
       <w:pPr>
-        <w:pStyle w:val="BodyText"/>
-      </w:pPr>
+        <w:pStyle w:val="CaptionedFigure"/>
+      </w:pPr>
+      <w:r>
+        <w:drawing>
+          <wp:inline>
+            <wp:extent cx="5334000" cy="2837563"/>
+            <wp:effectExtent b="0" l="0" r="0" t="0"/>
+            <wp:docPr descr="Os 93 controles de referência são agrupados em temas organizacionais, pessoas, físicos e tecnológicos." title="" id="65" name="Picture"/>
+            <a:graphic>
+              <a:graphicData uri="http://schemas.openxmlformats.org/drawingml/2006/picture">
+                <pic:pic>
+                  <pic:nvPicPr>
+                    <pic:cNvPr descr="media/image6.png" id="66" name="Picture"/>
+                    <pic:cNvPicPr>
+                      <a:picLocks noChangeArrowheads="1" noChangeAspect="1"/>
+                    </pic:cNvPicPr>
+                  </pic:nvPicPr>
+                  <pic:blipFill>
+                    <a:blip r:embed="rId64"/>
+                    <a:stretch>
+                      <a:fillRect/>
+                    </a:stretch>
+                  </pic:blipFill>
+                  <pic:spPr bwMode="auto">
+                    <a:xfrm>
+                      <a:off x="0" y="0"/>
+                      <a:ext cx="5334000" cy="2837563"/>
+                    </a:xfrm>
+                    <a:prstGeom prst="rect">
+                      <a:avLst/>
+                    </a:prstGeom>
+                    <a:noFill/>
+                    <a:ln w="9525">
+                      <a:noFill/>
+                      <a:headEnd/>
+                      <a:tailEnd/>
+                    </a:ln>
+                  </pic:spPr>
+                </pic:pic>
+              </a:graphicData>
+            </a:graphic>
+          </wp:inline>
+        </w:drawing>
+      </w:r>
+    </w:p>
+    <w:p>
+      <w:pPr>
+        <w:pStyle w:val="ImageCaption"/>
+      </w:pPr>
+      <w:r>
+        <w:t xml:space="preserve">Os 93 controles de referência são agrupados em temas organizacionais, pessoas, físicos e tecnológicos.</w:t>
+      </w:r>
     </w:p>
     <w:p>
       <w:pPr>
@@ -2625,9 +2899,9 @@
         <w:t xml:space="preserve">Figura 6. Temas de controlo do anexo A</w:t>
       </w:r>
     </w:p>
-    <w:bookmarkEnd w:id="49"/>
-    <w:bookmarkEnd w:id="50"/>
-    <w:bookmarkStart w:id="53" w:name="anexo-a-5-controlos-organizacionais"/>
+    <w:bookmarkEnd w:id="67"/>
+    <w:bookmarkEnd w:id="68"/>
+    <w:bookmarkStart w:id="74" w:name="anexo-a-5-controlos-organizacionais"/>
     <w:p>
       <w:pPr>
         <w:pStyle w:val="Heading1"/>
@@ -2648,7 +2922,7 @@
         <w:t xml:space="preserve">Resumos originais dos controlos de referência, foco de verificação e exemplos de provas.*</w:t>
       </w:r>
     </w:p>
-    <w:bookmarkStart w:id="51" w:name="X02bbc0372199da4e557124d326c0a93b9e9d595"/>
+    <w:bookmarkStart w:id="69" w:name="X02bbc0372199da4e557124d326c0a93b9e9d595"/>
     <w:p>
       <w:pPr>
         <w:pStyle w:val="Heading2"/>
@@ -2888,8 +3162,8 @@
         <w:t xml:space="preserve">Manter procedimentos operacionais documentados. Confirmar risco ou obrigação, design, proprietário, implementação, operação, exceções e medição. □ Procedimento, configuração, registro, registro, ticket, revisão, teste ou observação. □</w:t>
       </w:r>
     </w:p>
-    <w:bookmarkEnd w:id="51"/>
-    <w:bookmarkStart w:id="52" w:name="X476b32051434bc3cb9328bdd0ecabd39c9ccd67"/>
+    <w:bookmarkEnd w:id="69"/>
+    <w:bookmarkStart w:id="73" w:name="X476b32051434bc3cb9328bdd0ecabd39c9ccd67"/>
     <w:p>
       <w:pPr>
         <w:pStyle w:val="Heading2"/>
@@ -2900,8 +3174,58 @@
     </w:p>
     <w:p>
       <w:pPr>
-        <w:pStyle w:val="FirstParagraph"/>
-      </w:pPr>
+        <w:pStyle w:val="CaptionedFigure"/>
+      </w:pPr>
+      <w:r>
+        <w:drawing>
+          <wp:inline>
+            <wp:extent cx="5334000" cy="2859173"/>
+            <wp:effectExtent b="0" l="0" r="0" t="0"/>
+            <wp:docPr descr="Preparar, avaliar, responder, preservar evidências e aprender com incidentes." title="" id="71" name="Picture"/>
+            <a:graphic>
+              <a:graphicData uri="http://schemas.openxmlformats.org/drawingml/2006/picture">
+                <pic:pic>
+                  <pic:nvPicPr>
+                    <pic:cNvPr descr="media/image7.png" id="72" name="Picture"/>
+                    <pic:cNvPicPr>
+                      <a:picLocks noChangeArrowheads="1" noChangeAspect="1"/>
+                    </pic:cNvPicPr>
+                  </pic:nvPicPr>
+                  <pic:blipFill>
+                    <a:blip r:embed="rId70"/>
+                    <a:stretch>
+                      <a:fillRect/>
+                    </a:stretch>
+                  </pic:blipFill>
+                  <pic:spPr bwMode="auto">
+                    <a:xfrm>
+                      <a:off x="0" y="0"/>
+                      <a:ext cx="5334000" cy="2859173"/>
+                    </a:xfrm>
+                    <a:prstGeom prst="rect">
+                      <a:avLst/>
+                    </a:prstGeom>
+                    <a:noFill/>
+                    <a:ln w="9525">
+                      <a:noFill/>
+                      <a:headEnd/>
+                      <a:tailEnd/>
+                    </a:ln>
+                  </pic:spPr>
+                </pic:pic>
+              </a:graphicData>
+            </a:graphic>
+          </wp:inline>
+        </w:drawing>
+      </w:r>
+    </w:p>
+    <w:p>
+      <w:pPr>
+        <w:pStyle w:val="ImageCaption"/>
+      </w:pPr>
+      <w:r>
+        <w:t xml:space="preserve">Preparar, avaliar, responder, preservar evidências e aprender com incidentes.</w:t>
+      </w:r>
     </w:p>
     <w:p>
       <w:pPr>
@@ -2911,9 +3235,9 @@
         <w:t xml:space="preserve">Figura 7. Gestão de incidentes de segurança</w:t>
       </w:r>
     </w:p>
-    <w:bookmarkEnd w:id="52"/>
-    <w:bookmarkEnd w:id="53"/>
-    <w:bookmarkStart w:id="56" w:name="anexo-a-6-as-pessoas-controlam"/>
+    <w:bookmarkEnd w:id="73"/>
+    <w:bookmarkEnd w:id="74"/>
+    <w:bookmarkStart w:id="77" w:name="anexo-a-6-as-pessoas-controlam"/>
     <w:p>
       <w:pPr>
         <w:pStyle w:val="Heading1"/>
@@ -2934,7 +3258,7 @@
         <w:t xml:space="preserve">Resumos originais dos controlos de referência, foco de verificação e exemplos de provas.*</w:t>
       </w:r>
     </w:p>
-    <w:bookmarkStart w:id="54" w:name="X95263c4d35c382837785c898e74a220ccaa17a6"/>
+    <w:bookmarkStart w:id="75" w:name="X95263c4d35c382837785c898e74a220ccaa17a6"/>
     <w:p>
       <w:pPr>
         <w:pStyle w:val="Heading2"/>
@@ -3000,8 +3324,8 @@
         <w:t xml:space="preserve">6.8 Tornar a comunicação de eventos de segurança fácil e oportuna. Confirmar risco ou obrigação, design, proprietário, implementação, operação, exceções e medição. □ Procedimento, configuração, registro, registro, ticket, revisão, teste ou observação. □</w:t>
       </w:r>
     </w:p>
-    <w:bookmarkEnd w:id="54"/>
-    <w:bookmarkStart w:id="55" w:name="X76af68a866bb16a37fffa786c9c9d871968c705"/>
+    <w:bookmarkEnd w:id="75"/>
+    <w:bookmarkStart w:id="76" w:name="X76af68a866bb16a37fffa786c9c9d871968c705"/>
     <w:p>
       <w:pPr>
         <w:pStyle w:val="Heading2"/>
@@ -3010,9 +3334,9 @@
         <w:t xml:space="preserve">Regra da selecção:** O anexo A é um conjunto de referência utilizado para verificar se os controlos necessários não foram ignorados. A organização pode precisar de outros controles. Qualquer inclusão ou exclusão deve ser justificada através de tratamento de risco e registada na Declaração de Aplicabilidade. □</w:t>
       </w:r>
     </w:p>
-    <w:bookmarkEnd w:id="55"/>
-    <w:bookmarkEnd w:id="56"/>
-    <w:bookmarkStart w:id="61" w:name="anexo-a-7-controlos-físicos"/>
+    <w:bookmarkEnd w:id="76"/>
+    <w:bookmarkEnd w:id="77"/>
+    <w:bookmarkStart w:id="82" w:name="anexo-a-7-controlos-físicos"/>
     <w:p>
       <w:pPr>
         <w:pStyle w:val="Heading1"/>
@@ -3033,7 +3357,7 @@
         <w:t xml:space="preserve">Resumos originais dos controlos de referência, foco de verificação e exemplos de provas.*</w:t>
       </w:r>
     </w:p>
-    <w:bookmarkStart w:id="57" w:name="X73d8eda8a71a900735cc576b532f0f6fba63df2"/>
+    <w:bookmarkStart w:id="78" w:name="X73d8eda8a71a900735cc576b532f0f6fba63df2"/>
     <w:p>
       <w:pPr>
         <w:pStyle w:val="Heading2"/>
@@ -3135,8 +3459,8 @@
         <w:t xml:space="preserve">□ 7.14 □ Eliminar ou reutilizar equipamentos com segurança. Confirmar risco ou obrigação, design, proprietário, implementação, operação, exceções e medição. □ Procedimento, configuração, registro, registro, ticket, revisão, teste ou observação. □</w:t>
       </w:r>
     </w:p>
-    <w:bookmarkEnd w:id="57"/>
-    <w:bookmarkStart w:id="58" w:name="Xd88d894c72de2d96d3d0806e9e027fbbd68a3f5"/>
+    <w:bookmarkEnd w:id="78"/>
+    <w:bookmarkStart w:id="79" w:name="Xd88d894c72de2d96d3d0806e9e027fbbd68a3f5"/>
     <w:p>
       <w:pPr>
         <w:pStyle w:val="Heading2"/>
@@ -3169,8 +3493,8 @@
         <w:t xml:space="preserve">Resumos originais dos controlos de referência, foco de verificação e exemplos de provas.*</w:t>
       </w:r>
     </w:p>
-    <w:bookmarkEnd w:id="58"/>
-    <w:bookmarkStart w:id="59" w:name="X3dba293344d04e7d685e8e8944b794cc1361383"/>
+    <w:bookmarkEnd w:id="79"/>
+    <w:bookmarkStart w:id="80" w:name="X3dba293344d04e7d685e8e8944b794cc1361383"/>
     <w:p>
       <w:pPr>
         <w:pStyle w:val="Heading2"/>
@@ -3392,8 +3716,8 @@
         <w:t xml:space="preserve">8.34 . Proteger os sistemas operacionais durante os testes de auditoria. Confirmar risco ou obrigação, design, proprietário, implementação, operação, exceções e medição. □ Procedimento, configuração, registro, registro, ticket, revisão, teste ou observação. □</w:t>
       </w:r>
     </w:p>
-    <w:bookmarkEnd w:id="59"/>
-    <w:bookmarkStart w:id="60" w:name="Xe0b7c5bfe39e3db1e3197fddfabb4f50c408a2d"/>
+    <w:bookmarkEnd w:id="80"/>
+    <w:bookmarkStart w:id="81" w:name="Xe0b7c5bfe39e3db1e3197fddfabb4f50c408a2d"/>
     <w:p>
       <w:pPr>
         <w:pStyle w:val="Heading2"/>
@@ -3402,9 +3726,9 @@
         <w:t xml:space="preserve">Regra da selecção:** O anexo A é um conjunto de referência utilizado para verificar se os controlos necessários não foram ignorados. A organização pode precisar de outros controles. Qualquer inclusão ou exclusão deve ser justificada através de tratamento de risco e registada na Declaração de Aplicabilidade. □</w:t>
       </w:r>
     </w:p>
-    <w:bookmarkEnd w:id="60"/>
-    <w:bookmarkEnd w:id="61"/>
-    <w:bookmarkStart w:id="62" w:name="X477b85ca5372c11febb1de49731f71f0ae26d57"/>
+    <w:bookmarkEnd w:id="81"/>
+    <w:bookmarkEnd w:id="82"/>
+    <w:bookmarkStart w:id="83" w:name="X477b85ca5372c11febb1de49731f71f0ae26d57"/>
     <w:p>
       <w:pPr>
         <w:pStyle w:val="Heading1"/>
@@ -3527,8 +3851,8 @@
         <w:t xml:space="preserve">□——————————————————————————————————————————————————————————————————————————————————————————————————————————————————————————–</w:t>
       </w:r>
     </w:p>
-    <w:bookmarkEnd w:id="62"/>
-    <w:bookmarkStart w:id="63" w:name="métricas-e-testes-de-controle"/>
+    <w:bookmarkEnd w:id="83"/>
+    <w:bookmarkStart w:id="84" w:name="métricas-e-testes-de-controle"/>
     <w:p>
       <w:pPr>
         <w:pStyle w:val="Heading1"/>
@@ -3694,8 +4018,8 @@
         <w:t xml:space="preserve">Reteste e indicar a conclusão final e limitação restante.</w:t>
       </w:r>
     </w:p>
-    <w:bookmarkEnd w:id="63"/>
-    <w:bookmarkStart w:id="65" w:name="auditoria-interna"/>
+    <w:bookmarkEnd w:id="84"/>
+    <w:bookmarkStart w:id="86" w:name="auditoria-interna"/>
     <w:p>
       <w:pPr>
         <w:pStyle w:val="Heading1"/>
@@ -3764,7 +4088,7 @@
         <w:t xml:space="preserve">Reportar os resultados à gestão relevante e acompanhar as correções e ações corretivas através da revisão da eficácia.</w:t>
       </w:r>
     </w:p>
-    <w:bookmarkStart w:id="64" w:name="tipo-de-localização-resposta-exigida"/>
+    <w:bookmarkStart w:id="85" w:name="tipo-de-localização-resposta-exigida"/>
     <w:p>
       <w:pPr>
         <w:pStyle w:val="Heading2"/>
@@ -3799,9 +4123,9 @@
         <w:t xml:space="preserve">• Limitação da auditoria – Escopo, evidência, tempo, independência ou acesso restringiu a conclusão – Divulgar claramente e resolver quando possível</w:t>
       </w:r>
     </w:p>
-    <w:bookmarkEnd w:id="64"/>
-    <w:bookmarkEnd w:id="65"/>
-    <w:bookmarkStart w:id="66" w:name="revisão-de-gestão-e-ação-corretiva"/>
+    <w:bookmarkEnd w:id="85"/>
+    <w:bookmarkEnd w:id="86"/>
+    <w:bookmarkStart w:id="87" w:name="revisão-de-gestão-e-ação-corretiva"/>
     <w:p>
       <w:pPr>
         <w:pStyle w:val="Heading1"/>
@@ -3949,8 +4273,8 @@
         <w:t xml:space="preserve">Atualizar risco, controles, documentos, treinamento, objetivos e SoA quando necessário.</w:t>
       </w:r>
     </w:p>
-    <w:bookmarkEnd w:id="66"/>
-    <w:bookmarkStart w:id="68" w:name="preparação-da-certificação"/>
+    <w:bookmarkEnd w:id="87"/>
+    <w:bookmarkStart w:id="92" w:name="preparação-da-certificação"/>
     <w:p>
       <w:pPr>
         <w:pStyle w:val="Heading1"/>
@@ -3973,86 +4297,136 @@
     </w:p>
     <w:p>
       <w:pPr>
+        <w:pStyle w:val="CaptionedFigure"/>
+      </w:pPr>
+      <w:r>
+        <w:drawing>
+          <wp:inline>
+            <wp:extent cx="5334000" cy="2945449"/>
+            <wp:effectExtent b="0" l="0" r="0" t="0"/>
+            <wp:docPr descr="A disponibilidade é seguida de avaliação de certificação e atividades de vigilância e renovação contínuas." title="" id="89" name="Picture"/>
+            <a:graphic>
+              <a:graphicData uri="http://schemas.openxmlformats.org/drawingml/2006/picture">
+                <pic:pic>
+                  <pic:nvPicPr>
+                    <pic:cNvPr descr="media/image8.png" id="90" name="Picture"/>
+                    <pic:cNvPicPr>
+                      <a:picLocks noChangeArrowheads="1" noChangeAspect="1"/>
+                    </pic:cNvPicPr>
+                  </pic:nvPicPr>
+                  <pic:blipFill>
+                    <a:blip r:embed="rId88"/>
+                    <a:stretch>
+                      <a:fillRect/>
+                    </a:stretch>
+                  </pic:blipFill>
+                  <pic:spPr bwMode="auto">
+                    <a:xfrm>
+                      <a:off x="0" y="0"/>
+                      <a:ext cx="5334000" cy="2945449"/>
+                    </a:xfrm>
+                    <a:prstGeom prst="rect">
+                      <a:avLst/>
+                    </a:prstGeom>
+                    <a:noFill/>
+                    <a:ln w="9525">
+                      <a:noFill/>
+                      <a:headEnd/>
+                      <a:tailEnd/>
+                    </a:ln>
+                  </pic:spPr>
+                </pic:pic>
+              </a:graphicData>
+            </a:graphic>
+          </wp:inline>
+        </w:drawing>
+      </w:r>
+    </w:p>
+    <w:p>
+      <w:pPr>
+        <w:pStyle w:val="ImageCaption"/>
+      </w:pPr>
+      <w:r>
+        <w:t xml:space="preserve">A disponibilidade é seguida de avaliação de certificação e atividades de vigilância e renovação contínuas.</w:t>
+      </w:r>
+    </w:p>
+    <w:p>
+      <w:pPr>
+        <w:pStyle w:val="BodyText"/>
+      </w:pPr>
+      <w:r>
+        <w:t xml:space="preserve">Figura 8. Caminho de certificação</w:t>
+      </w:r>
+    </w:p>
+    <w:p>
+      <w:pPr>
+        <w:pStyle w:val="BodyText"/>
+      </w:pPr>
+      <w:r>
+        <w:t xml:space="preserve">A certificação é opcional; as organizações podem implementar ISO/IEC 27001 sem procurar um certificado.</w:t>
+      </w:r>
+    </w:p>
+    <w:p>
+      <w:pPr>
+        <w:pStyle w:val="BodyText"/>
+      </w:pPr>
+      <w:r>
+        <w:t xml:space="preserve">ISO não realiza certificação. Um organismo de certificação independente realiza auditorias de certificação.</w:t>
+      </w:r>
+    </w:p>
+    <w:p>
+      <w:pPr>
+        <w:pStyle w:val="BodyText"/>
+      </w:pPr>
+      <w:r>
+        <w:t xml:space="preserve">A acreditação proporciona uma confiança adicional na competência de um organismo de certificação; verificar o âmbito de acreditação e de certificação relevantes.</w:t>
+      </w:r>
+    </w:p>
+    <w:p>
+      <w:pPr>
+        <w:pStyle w:val="BodyText"/>
+      </w:pPr>
+      <w:r>
+        <w:t xml:space="preserve">A Fase 1 avalia geralmente a prontidão, o âmbito, o sistema documentado e a preparação para a auditoria de execução.</w:t>
+      </w:r>
+    </w:p>
+    <w:p>
+      <w:pPr>
+        <w:pStyle w:val="BodyText"/>
+      </w:pPr>
+      <w:r>
+        <w:t xml:space="preserve">A fase 2 avalia a implementação e a eficácia em todo o âmbito definido.</w:t>
+      </w:r>
+    </w:p>
+    <w:p>
+      <w:pPr>
+        <w:pStyle w:val="BodyText"/>
+      </w:pPr>
+      <w:r>
+        <w:t xml:space="preserve">As atividades de vigilância e recertificação avaliam a conformidade contínua; os pormenores devem ser confirmados com o organismo de certificação seleccionado e as regras de acreditação.</w:t>
+      </w:r>
+    </w:p>
+    <w:p>
+      <w:pPr>
+        <w:pStyle w:val="BodyText"/>
+      </w:pPr>
+      <w:r>
+        <w:t xml:space="preserve">Um certificado tem alcance e tempo limite. Ele não prova que cada produto é seguro, que nenhum incidente pode ocorrer, ou que cada sistema na empresa está incluído.</w:t>
+      </w:r>
+    </w:p>
+    <w:bookmarkStart w:id="91" w:name="X0cda135e373cbeb3b40ddbd0b9bbf6c1f06b74b"/>
+    <w:p>
+      <w:pPr>
+        <w:pStyle w:val="Heading2"/>
+      </w:pPr>
+      <w:r>
+        <w:t xml:space="preserve">Área de preparação** Verificação de aceitação**</w:t>
+      </w:r>
+    </w:p>
+    <w:p>
+      <w:pPr>
         <w:pStyle w:val="FirstParagraph"/>
       </w:pPr>
-    </w:p>
-    <w:p>
-      <w:pPr>
-        <w:pStyle w:val="BodyText"/>
-      </w:pPr>
-      <w:r>
-        <w:t xml:space="preserve">Figura 8. Caminho de certificação</w:t>
-      </w:r>
-    </w:p>
-    <w:p>
-      <w:pPr>
-        <w:pStyle w:val="BodyText"/>
-      </w:pPr>
-      <w:r>
-        <w:t xml:space="preserve">A certificação é opcional; as organizações podem implementar ISO/IEC 27001 sem procurar um certificado.</w:t>
-      </w:r>
-    </w:p>
-    <w:p>
-      <w:pPr>
-        <w:pStyle w:val="BodyText"/>
-      </w:pPr>
-      <w:r>
-        <w:t xml:space="preserve">ISO não realiza certificação. Um organismo de certificação independente realiza auditorias de certificação.</w:t>
-      </w:r>
-    </w:p>
-    <w:p>
-      <w:pPr>
-        <w:pStyle w:val="BodyText"/>
-      </w:pPr>
-      <w:r>
-        <w:t xml:space="preserve">A acreditação proporciona uma confiança adicional na competência de um organismo de certificação; verificar o âmbito de acreditação e de certificação relevantes.</w:t>
-      </w:r>
-    </w:p>
-    <w:p>
-      <w:pPr>
-        <w:pStyle w:val="BodyText"/>
-      </w:pPr>
-      <w:r>
-        <w:t xml:space="preserve">A Fase 1 avalia geralmente a prontidão, o âmbito, o sistema documentado e a preparação para a auditoria de execução.</w:t>
-      </w:r>
-    </w:p>
-    <w:p>
-      <w:pPr>
-        <w:pStyle w:val="BodyText"/>
-      </w:pPr>
-      <w:r>
-        <w:t xml:space="preserve">A fase 2 avalia a implementação e a eficácia em todo o âmbito definido.</w:t>
-      </w:r>
-    </w:p>
-    <w:p>
-      <w:pPr>
-        <w:pStyle w:val="BodyText"/>
-      </w:pPr>
-      <w:r>
-        <w:t xml:space="preserve">As atividades de vigilância e recertificação avaliam a conformidade contínua; os pormenores devem ser confirmados com o organismo de certificação seleccionado e as regras de acreditação.</w:t>
-      </w:r>
-    </w:p>
-    <w:p>
-      <w:pPr>
-        <w:pStyle w:val="BodyText"/>
-      </w:pPr>
-      <w:r>
-        <w:t xml:space="preserve">Um certificado tem alcance e tempo limite. Ele não prova que cada produto é seguro, que nenhum incidente pode ocorrer, ou que cada sistema na empresa está incluído.</w:t>
-      </w:r>
-    </w:p>
-    <w:bookmarkStart w:id="67" w:name="X0cda135e373cbeb3b40ddbd0b9bbf6c1f06b74b"/>
-    <w:p>
-      <w:pPr>
-        <w:pStyle w:val="Heading2"/>
-      </w:pPr>
-      <w:r>
-        <w:t xml:space="preserve">Área de preparação** Verificação de aceitação**</w:t>
-      </w:r>
-    </w:p>
-    <w:p>
-      <w:pPr>
-        <w:pStyle w:val="FirstParagraph"/>
-      </w:pPr>
       <w:r>
         <w:t xml:space="preserve">• Escopo • Claro, suportável, refletido em operações reais e intenção de certificado</w:t>
       </w:r>
@@ -4099,9 +4473,9 @@
         <w:t xml:space="preserve">Emenda □ Relevância climática e requisitos das partes interessadas considerados e evidenciados</w:t>
       </w:r>
     </w:p>
-    <w:bookmarkEnd w:id="67"/>
-    <w:bookmarkEnd w:id="68"/>
-    <w:bookmarkStart w:id="70" w:name="ferramentas-de-código-aberto"/>
+    <w:bookmarkEnd w:id="91"/>
+    <w:bookmarkEnd w:id="92"/>
+    <w:bookmarkStart w:id="94" w:name="ferramentas-de-código-aberto"/>
     <w:p>
       <w:pPr>
         <w:pStyle w:val="Heading1"/>
@@ -4122,7 +4496,7 @@
         <w:t xml:space="preserve">Links oficiais, inícios rápidos seguros, evidências e limitações.*</w:t>
       </w:r>
     </w:p>
-    <w:bookmarkStart w:id="69" w:name="X27512f29e57498a0da0e899819aa42b0da6ab2e"/>
+    <w:bookmarkStart w:id="93" w:name="X27512f29e57498a0da0e899819aa42b0da6ab2e"/>
     <w:p>
       <w:pPr>
         <w:pStyle w:val="Heading2"/>
@@ -4279,9 +4653,9 @@
         <w:t xml:space="preserve">(—————————————————————————————————————————————————————————————————————————————————————</w:t>
       </w:r>
     </w:p>
-    <w:bookmarkEnd w:id="69"/>
-    <w:bookmarkEnd w:id="70"/>
-    <w:bookmarkStart w:id="72" w:name="assistente-ciso"/>
+    <w:bookmarkEnd w:id="93"/>
+    <w:bookmarkEnd w:id="94"/>
+    <w:bookmarkStart w:id="96" w:name="assistente-ciso"/>
     <w:p>
       <w:pPr>
         <w:pStyle w:val="Heading1"/>
@@ -4300,7 +4674,7 @@
       <w:r>
         <w:t xml:space="preserve"> </w:t>
       </w:r>
-      <w:hyperlink r:id="rId71">
+      <w:hyperlink r:id="rId95">
         <w:r>
           <w:rPr>
             <w:rStyle w:val="Hyperlink"/>
@@ -4325,8 +4699,8 @@
         <w:t xml:space="preserve">Evidência: escopo aprovado, configuração, versão, cobertura, resultados, revisão, exceção, remediação e reteste. Proteja credenciais, registros, relatórios e backups.</w:t>
       </w:r>
     </w:p>
-    <w:bookmarkEnd w:id="72"/>
-    <w:bookmarkStart w:id="74" w:name="comunidade-de-risco-simples"/>
+    <w:bookmarkEnd w:id="96"/>
+    <w:bookmarkStart w:id="98" w:name="comunidade-de-risco-simples"/>
     <w:p>
       <w:pPr>
         <w:pStyle w:val="Heading1"/>
@@ -4345,7 +4719,7 @@
       <w:r>
         <w:t xml:space="preserve"> </w:t>
       </w:r>
-      <w:hyperlink r:id="rId73">
+      <w:hyperlink r:id="rId97">
         <w:r>
           <w:rPr>
             <w:rStyle w:val="Hyperlink"/>
@@ -4370,8 +4744,8 @@
         <w:t xml:space="preserve">Evidência: escopo aprovado, configuração, versão, cobertura, resultados, revisão, exceção, remediação e reteste. Proteja credenciais, registros, relatórios e backups.</w:t>
       </w:r>
     </w:p>
-    <w:bookmarkEnd w:id="74"/>
-    <w:bookmarkStart w:id="76" w:name="wazuh"/>
+    <w:bookmarkEnd w:id="98"/>
+    <w:bookmarkStart w:id="100" w:name="wazuh"/>
     <w:p>
       <w:pPr>
         <w:pStyle w:val="Heading1"/>
@@ -4390,7 +4764,7 @@
       <w:r>
         <w:t xml:space="preserve"> </w:t>
       </w:r>
-      <w:hyperlink r:id="rId75">
+      <w:hyperlink r:id="rId99">
         <w:r>
           <w:rPr>
             <w:rStyle w:val="Hyperlink"/>
@@ -4415,8 +4789,8 @@
         <w:t xml:space="preserve">Evidência: escopo aprovado, configuração, versão, cobertura, resultados, revisão, exceção, remediação e reteste. Proteja credenciais, registros, relatórios e backups.</w:t>
       </w:r>
     </w:p>
-    <w:bookmarkEnd w:id="76"/>
-    <w:bookmarkStart w:id="78" w:name="osquery"/>
+    <w:bookmarkEnd w:id="100"/>
+    <w:bookmarkStart w:id="102" w:name="osquery"/>
     <w:p>
       <w:pPr>
         <w:pStyle w:val="Heading1"/>
@@ -4435,7 +4809,7 @@
       <w:r>
         <w:t xml:space="preserve"> </w:t>
       </w:r>
-      <w:hyperlink r:id="rId77">
+      <w:hyperlink r:id="rId101">
         <w:r>
           <w:rPr>
             <w:rStyle w:val="Hyperlink"/>
@@ -4460,8 +4834,8 @@
         <w:t xml:space="preserve">Evidência: escopo aprovado, configuração, versão, cobertura, resultados, revisão, exceção, remediação e reteste. Proteja credenciais, registros, relatórios e backups.</w:t>
       </w:r>
     </w:p>
-    <w:bookmarkEnd w:id="78"/>
-    <w:bookmarkStart w:id="82" w:name="openscap"/>
+    <w:bookmarkEnd w:id="102"/>
+    <w:bookmarkStart w:id="106" w:name="openscap"/>
     <w:p>
       <w:pPr>
         <w:pStyle w:val="Heading1"/>
@@ -4480,7 +4854,7 @@
       <w:r>
         <w:t xml:space="preserve"> </w:t>
       </w:r>
-      <w:hyperlink r:id="rId79">
+      <w:hyperlink r:id="rId103">
         <w:r>
           <w:rPr>
             <w:rStyle w:val="Hyperlink"/>
@@ -4505,7 +4879,7 @@
         <w:t xml:space="preserve">Evidência: escopo aprovado, configuração, versão, cobertura, resultados, revisão, exceção, remediação e reteste. Proteja credenciais, registros, relatórios e backups.</w:t>
       </w:r>
     </w:p>
-    <w:bookmarkStart w:id="81" w:name="greenbone-community-edition"/>
+    <w:bookmarkStart w:id="105" w:name="greenbone-community-edition"/>
     <w:p>
       <w:pPr>
         <w:pStyle w:val="Heading2"/>
@@ -4524,7 +4898,7 @@
       <w:r>
         <w:t xml:space="preserve"> </w:t>
       </w:r>
-      <w:hyperlink r:id="rId80">
+      <w:hyperlink r:id="rId104">
         <w:r>
           <w:rPr>
             <w:rStyle w:val="Hyperlink"/>
@@ -4549,9 +4923,9 @@
         <w:t xml:space="preserve">Evidência: escopo aprovado, configuração, versão, cobertura, resultados, revisão, exceção, remediação e reteste. Proteja credenciais, registros, relatórios e backups.</w:t>
       </w:r>
     </w:p>
-    <w:bookmarkEnd w:id="81"/>
-    <w:bookmarkEnd w:id="82"/>
-    <w:bookmarkStart w:id="86" w:name="nmap"/>
+    <w:bookmarkEnd w:id="105"/>
+    <w:bookmarkEnd w:id="106"/>
+    <w:bookmarkStart w:id="110" w:name="nmap"/>
     <w:p>
       <w:pPr>
         <w:pStyle w:val="Heading1"/>
@@ -4570,7 +4944,7 @@
       <w:r>
         <w:t xml:space="preserve"> </w:t>
       </w:r>
-      <w:hyperlink r:id="rId83">
+      <w:hyperlink r:id="rId107">
         <w:r>
           <w:rPr>
             <w:rStyle w:val="Hyperlink"/>
@@ -4595,7 +4969,7 @@
         <w:t xml:space="preserve">Evidência: escopo aprovado, configuração, versão, cobertura, resultados, revisão, exceção, remediação e reteste. Proteja credenciais, registros, relatórios e backups.</w:t>
       </w:r>
     </w:p>
-    <w:bookmarkStart w:id="85" w:name="trivy"/>
+    <w:bookmarkStart w:id="109" w:name="trivy"/>
     <w:p>
       <w:pPr>
         <w:pStyle w:val="Heading2"/>
@@ -4614,7 +4988,7 @@
       <w:r>
         <w:t xml:space="preserve"> </w:t>
       </w:r>
-      <w:hyperlink r:id="rId84">
+      <w:hyperlink r:id="rId108">
         <w:r>
           <w:rPr>
             <w:rStyle w:val="Hyperlink"/>
@@ -4639,9 +5013,9 @@
         <w:t xml:space="preserve">Evidência: escopo aprovado, configuração, versão, cobertura, resultados, revisão, exceção, remediação e reteste. Proteja credenciais, registros, relatórios e backups.</w:t>
       </w:r>
     </w:p>
-    <w:bookmarkEnd w:id="85"/>
-    <w:bookmarkEnd w:id="86"/>
-    <w:bookmarkStart w:id="94" w:name="owasp-zap"/>
+    <w:bookmarkEnd w:id="109"/>
+    <w:bookmarkEnd w:id="110"/>
+    <w:bookmarkStart w:id="118" w:name="owasp-zap"/>
     <w:p>
       <w:pPr>
         <w:pStyle w:val="Heading1"/>
@@ -4660,7 +5034,7 @@
       <w:r>
         <w:t xml:space="preserve"> </w:t>
       </w:r>
-      <w:hyperlink r:id="rId87">
+      <w:hyperlink r:id="rId111">
         <w:r>
           <w:rPr>
             <w:rStyle w:val="Hyperlink"/>
@@ -4685,7 +5059,7 @@
         <w:t xml:space="preserve">Evidência: escopo aprovado, configuração, versão, cobertura, resultados, revisão, exceção, remediação e reteste. Proteja credenciais, registros, relatórios e backups.</w:t>
       </w:r>
     </w:p>
-    <w:bookmarkStart w:id="89" w:name="keycloak"/>
+    <w:bookmarkStart w:id="113" w:name="keycloak"/>
     <w:p>
       <w:pPr>
         <w:pStyle w:val="Heading2"/>
@@ -4704,7 +5078,7 @@
       <w:r>
         <w:t xml:space="preserve"> </w:t>
       </w:r>
-      <w:hyperlink r:id="rId88">
+      <w:hyperlink r:id="rId112">
         <w:r>
           <w:rPr>
             <w:rStyle w:val="Hyperlink"/>
@@ -4729,8 +5103,8 @@
         <w:t xml:space="preserve">Evidência: escopo aprovado, configuração, versão, cobertura, resultados, revisão, exceção, remediação e reteste. Proteja credenciais, registros, relatórios e backups.</w:t>
       </w:r>
     </w:p>
-    <w:bookmarkEnd w:id="89"/>
-    <w:bookmarkStart w:id="91" w:name="defectdojo"/>
+    <w:bookmarkEnd w:id="113"/>
+    <w:bookmarkStart w:id="115" w:name="defectdojo"/>
     <w:p>
       <w:pPr>
         <w:pStyle w:val="Heading2"/>
@@ -4749,7 +5123,7 @@
       <w:r>
         <w:t xml:space="preserve"> </w:t>
       </w:r>
-      <w:hyperlink r:id="rId90">
+      <w:hyperlink r:id="rId114">
         <w:r>
           <w:rPr>
             <w:rStyle w:val="Hyperlink"/>
@@ -4774,8 +5148,8 @@
         <w:t xml:space="preserve">Evidência: escopo aprovado, configuração, versão, cobertura, resultados, revisão, exceção, remediação e reteste. Proteja credenciais, registros, relatórios e backups.</w:t>
       </w:r>
     </w:p>
-    <w:bookmarkEnd w:id="91"/>
-    <w:bookmarkStart w:id="93" w:name="adeus"/>
+    <w:bookmarkEnd w:id="115"/>
+    <w:bookmarkStart w:id="117" w:name="adeus"/>
     <w:p>
       <w:pPr>
         <w:pStyle w:val="Heading2"/>
@@ -4794,7 +5168,7 @@
       <w:r>
         <w:t xml:space="preserve"> </w:t>
       </w:r>
-      <w:hyperlink r:id="rId92">
+      <w:hyperlink r:id="rId116">
         <w:r>
           <w:rPr>
             <w:rStyle w:val="Hyperlink"/>
@@ -4819,9 +5193,9 @@
         <w:t xml:space="preserve">Evidência: escopo aprovado, configuração, versão, cobertura, resultados, revisão, exceção, remediação e reteste. Proteja credenciais, registros, relatórios e backups.</w:t>
       </w:r>
     </w:p>
-    <w:bookmarkEnd w:id="93"/>
-    <w:bookmarkEnd w:id="94"/>
-    <w:bookmarkStart w:id="96" w:name="lynis"/>
+    <w:bookmarkEnd w:id="117"/>
+    <w:bookmarkEnd w:id="118"/>
+    <w:bookmarkStart w:id="120" w:name="lynis"/>
     <w:p>
       <w:pPr>
         <w:pStyle w:val="Heading1"/>
@@ -4840,7 +5214,7 @@
       <w:r>
         <w:t xml:space="preserve"> </w:t>
       </w:r>
-      <w:hyperlink r:id="rId95">
+      <w:hyperlink r:id="rId119">
         <w:r>
           <w:rPr>
             <w:rStyle w:val="Hyperlink"/>
@@ -4865,8 +5239,8 @@
         <w:t xml:space="preserve">Evidência: escopo aprovado, configuração, versão, cobertura, resultados, revisão, exceção, remediação e reteste. Proteja credenciais, registros, relatórios e backups.</w:t>
       </w:r>
     </w:p>
-    <w:bookmarkEnd w:id="96"/>
-    <w:bookmarkStart w:id="98" w:name="open-policy-agent"/>
+    <w:bookmarkEnd w:id="120"/>
+    <w:bookmarkStart w:id="122" w:name="open-policy-agent"/>
     <w:p>
       <w:pPr>
         <w:pStyle w:val="Heading1"/>
@@ -4885,7 +5259,7 @@
       <w:r>
         <w:t xml:space="preserve"> </w:t>
       </w:r>
-      <w:hyperlink r:id="rId97">
+      <w:hyperlink r:id="rId121">
         <w:r>
           <w:rPr>
             <w:rStyle w:val="Hyperlink"/>
@@ -4910,8 +5284,8 @@
         <w:t xml:space="preserve">Evidência: escopo aprovado, configuração, versão, cobertura, resultados, revisão, exceção, remediação e reteste. Proteja credenciais, registros, relatórios e backups.</w:t>
       </w:r>
     </w:p>
-    <w:bookmarkEnd w:id="98"/>
-    <w:bookmarkStart w:id="100" w:name="manual-do-sgsi-para-gerentes"/>
+    <w:bookmarkEnd w:id="122"/>
+    <w:bookmarkStart w:id="124" w:name="manual-do-sgsi-para-gerentes"/>
     <w:p>
       <w:pPr>
         <w:pStyle w:val="Heading1"/>
@@ -4996,7 +5370,7 @@
         <w:t xml:space="preserve">As reivindicações de certificação, escopo, acreditação e declarações do cliente são precisas?</w:t>
       </w:r>
     </w:p>
-    <w:bookmarkStart w:id="99" w:name="section-1"/>
+    <w:bookmarkStart w:id="123" w:name="section-1"/>
     <w:p>
       <w:pPr>
         <w:pStyle w:val="Heading2"/>
@@ -5055,9 +5429,9 @@
         <w:t xml:space="preserve">□ Certificação □ As reivindicações são avaliadas, atuais e suportáveis? Verde / Amarelo / Vermelho</w:t>
       </w:r>
     </w:p>
-    <w:bookmarkEnd w:id="99"/>
-    <w:bookmarkEnd w:id="100"/>
-    <w:bookmarkStart w:id="101" w:name="guia-de-carreira-do-analista-júnior"/>
+    <w:bookmarkEnd w:id="123"/>
+    <w:bookmarkEnd w:id="124"/>
+    <w:bookmarkStart w:id="128" w:name="guia-de-carreira-do-analista-júnior"/>
     <w:p>
       <w:pPr>
         <w:pStyle w:val="Heading1"/>
@@ -5080,176 +5454,609 @@
     </w:p>
     <w:p>
       <w:pPr>
+        <w:pStyle w:val="CaptionedFigure"/>
+      </w:pPr>
+      <w:r>
+        <w:drawing>
+          <wp:inline>
+            <wp:extent cx="5334000" cy="2667000"/>
+            <wp:effectExtent b="0" l="0" r="0" t="0"/>
+            <wp:docPr descr="Aprenda o sistema, requisitos de mapa, provas de teste, relatório claramente, e construir um portfólio honesto." title="" id="126" name="Picture"/>
+            <a:graphic>
+              <a:graphicData uri="http://schemas.openxmlformats.org/drawingml/2006/picture">
+                <pic:pic>
+                  <pic:nvPicPr>
+                    <pic:cNvPr descr="media/image9.png" id="127" name="Picture"/>
+                    <pic:cNvPicPr>
+                      <a:picLocks noChangeArrowheads="1" noChangeAspect="1"/>
+                    </pic:cNvPicPr>
+                  </pic:nvPicPr>
+                  <pic:blipFill>
+                    <a:blip r:embed="rId125"/>
+                    <a:stretch>
+                      <a:fillRect/>
+                    </a:stretch>
+                  </pic:blipFill>
+                  <pic:spPr bwMode="auto">
+                    <a:xfrm>
+                      <a:off x="0" y="0"/>
+                      <a:ext cx="5334000" cy="2667000"/>
+                    </a:xfrm>
+                    <a:prstGeom prst="rect">
+                      <a:avLst/>
+                    </a:prstGeom>
+                    <a:noFill/>
+                    <a:ln w="9525">
+                      <a:noFill/>
+                      <a:headEnd/>
+                      <a:tailEnd/>
+                    </a:ln>
+                  </pic:spPr>
+                </pic:pic>
+              </a:graphicData>
+            </a:graphic>
+          </wp:inline>
+        </w:drawing>
+      </w:r>
+    </w:p>
+    <w:p>
+      <w:pPr>
+        <w:pStyle w:val="ImageCaption"/>
+      </w:pPr>
+      <w:r>
+        <w:t xml:space="preserve">Aprenda o sistema, requisitos de mapa, provas de teste, relatório claramente, e construir um portfólio honesto.</w:t>
+      </w:r>
+    </w:p>
+    <w:p>
+      <w:pPr>
+        <w:pStyle w:val="BodyText"/>
+      </w:pPr>
+      <w:r>
+        <w:t xml:space="preserve">Figura 9. Caminho de analista ISO 27001 Júnior</w:t>
+      </w:r>
+    </w:p>
+    <w:p>
+      <w:pPr>
+        <w:pStyle w:val="BodyText"/>
+      </w:pPr>
+      <w:r>
+        <w:t xml:space="preserve">GRC Júnior Analisador</w:t>
+      </w:r>
+    </w:p>
+    <w:p>
+      <w:pPr>
+        <w:pStyle w:val="BodyText"/>
+      </w:pPr>
+      <w:r>
+        <w:t xml:space="preserve">Analisador de conformidade ISO 27001</w:t>
+      </w:r>
+    </w:p>
+    <w:p>
+      <w:pPr>
+        <w:pStyle w:val="BodyText"/>
+      </w:pPr>
+      <w:r>
+        <w:t xml:space="preserve">Analista de Controles de Segurança</w:t>
+      </w:r>
+    </w:p>
+    <w:p>
+      <w:pPr>
+        <w:pStyle w:val="BodyText"/>
+      </w:pPr>
+      <w:r>
+        <w:t xml:space="preserve">Coordenador do ISMS</w:t>
+      </w:r>
+    </w:p>
+    <w:p>
+      <w:pPr>
+        <w:pStyle w:val="BodyText"/>
+      </w:pPr>
+      <w:r>
+        <w:t xml:space="preserve">Analista de Risco</w:t>
+      </w:r>
+    </w:p>
+    <w:p>
+      <w:pPr>
+        <w:pStyle w:val="BodyText"/>
+      </w:pPr>
+      <w:r>
+        <w:t xml:space="preserve">Associado à Auditoria Interna</w:t>
+      </w:r>
+    </w:p>
+    <w:p>
+      <w:pPr>
+        <w:pStyle w:val="BodyText"/>
+      </w:pPr>
+      <w:r>
+        <w:t xml:space="preserve">Analista de Riscos de Terceiros</w:t>
+      </w:r>
+    </w:p>
+    <w:p>
+      <w:pPr>
+        <w:pStyle w:val="BodyText"/>
+      </w:pPr>
+      <w:r>
+        <w:t xml:space="preserve">Analista de Garantia de Segurança</w:t>
+      </w:r>
+    </w:p>
+    <w:bookmarkEnd w:id="128"/>
+    <w:bookmarkStart w:id="129" w:name="típico-trabalho-júnior"/>
+    <w:p>
+      <w:pPr>
+        <w:pStyle w:val="Heading1"/>
+      </w:pPr>
+      <w:r>
+        <w:t xml:space="preserve"># 24,1 Típico trabalho júnior</w:t>
+      </w:r>
+    </w:p>
+    <w:p>
+      <w:pPr>
+        <w:numPr>
+          <w:ilvl w:val="0"/>
+          <w:numId w:val="1034"/>
+        </w:numPr>
+      </w:pPr>
+      <w:r>
+        <w:t xml:space="preserve">Manter escopo, ativo, obrigação, fornecedor, risco, controle, SoA, evidências, achados e registros de ação.</w:t>
+      </w:r>
+    </w:p>
+    <w:p>
+      <w:pPr>
+        <w:numPr>
+          <w:ilvl w:val="0"/>
+          <w:numId w:val="1034"/>
+        </w:numPr>
+      </w:pPr>
+      <w:r>
+        <w:t xml:space="preserve">Recolha provas sem alterar os registos e valide a integralidade.</w:t>
+      </w:r>
+    </w:p>
+    <w:p>
+      <w:pPr>
+        <w:numPr>
+          <w:ilvl w:val="0"/>
+          <w:numId w:val="1034"/>
+        </w:numPr>
+      </w:pPr>
+      <w:r>
+        <w:t xml:space="preserve">Mapa riscos e requisitos para controles, proprietários, procedimentos, sistemas e provas.</w:t>
+      </w:r>
+    </w:p>
+    <w:p>
+      <w:pPr>
+        <w:numPr>
+          <w:ilvl w:val="0"/>
+          <w:numId w:val="1034"/>
+        </w:numPr>
+      </w:pPr>
+      <w:r>
+        <w:t xml:space="preserve">Teste amostras de acesso, mudança, vulnerabilidade, incidente, backup, fornecedor, consciência, física e controles de continuidade.</w:t>
+      </w:r>
+    </w:p>
+    <w:p>
+      <w:pPr>
+        <w:numPr>
+          <w:ilvl w:val="0"/>
+          <w:numId w:val="1034"/>
+        </w:numPr>
+      </w:pPr>
+      <w:r>
+        <w:t xml:space="preserve">Apoiar auditorias internas, análises de gestão, métricas, ações corretivas e preparação de certificação.</w:t>
+      </w:r>
+    </w:p>
+    <w:p>
+      <w:pPr>
+        <w:numPr>
+          <w:ilvl w:val="0"/>
+          <w:numId w:val="1034"/>
+        </w:numPr>
+      </w:pPr>
+      <w:r>
+        <w:t xml:space="preserve">Escreva conclusões factuais e divulgue limitações de amostragem, escopo e provas.</w:t>
+      </w:r>
+    </w:p>
+    <w:p>
+      <w:pPr>
+        <w:numPr>
+          <w:ilvl w:val="0"/>
+          <w:numId w:val="1034"/>
+        </w:numPr>
+      </w:pPr>
+      <w:r>
+        <w:t xml:space="preserve">Proteger informações confidenciais e permanecer dentro da autorização.</w:t>
+      </w:r>
+    </w:p>
+    <w:bookmarkEnd w:id="129"/>
+    <w:bookmarkStart w:id="130" w:name="valor-dos-empregadores-de-competências"/>
+    <w:p>
+      <w:pPr>
+        <w:pStyle w:val="Heading1"/>
+      </w:pPr>
+      <w:r>
+        <w:t xml:space="preserve"># 24.2 Valor dos empregadores de competências</w:t>
+      </w:r>
+    </w:p>
+    <w:p>
+      <w:pPr>
         <w:pStyle w:val="FirstParagraph"/>
       </w:pPr>
-    </w:p>
-    <w:p>
-      <w:pPr>
-        <w:pStyle w:val="BodyText"/>
-      </w:pPr>
-      <w:r>
-        <w:t xml:space="preserve">Figura 9. Caminho de analista ISO 27001 Júnior</w:t>
-      </w:r>
-    </w:p>
-    <w:p>
-      <w:pPr>
-        <w:pStyle w:val="BodyText"/>
-      </w:pPr>
-      <w:r>
-        <w:t xml:space="preserve">GRC Júnior Analisador</w:t>
-      </w:r>
-    </w:p>
-    <w:p>
-      <w:pPr>
-        <w:pStyle w:val="BodyText"/>
-      </w:pPr>
-      <w:r>
-        <w:t xml:space="preserve">Analisador de conformidade ISO 27001</w:t>
-      </w:r>
-    </w:p>
-    <w:p>
-      <w:pPr>
-        <w:pStyle w:val="BodyText"/>
-      </w:pPr>
-      <w:r>
-        <w:t xml:space="preserve">Analista de Controles de Segurança</w:t>
-      </w:r>
-    </w:p>
-    <w:p>
-      <w:pPr>
-        <w:pStyle w:val="BodyText"/>
-      </w:pPr>
-      <w:r>
-        <w:t xml:space="preserve">Coordenador do ISMS</w:t>
-      </w:r>
-    </w:p>
-    <w:p>
-      <w:pPr>
-        <w:pStyle w:val="BodyText"/>
-      </w:pPr>
-      <w:r>
-        <w:t xml:space="preserve">Analista de Risco</w:t>
-      </w:r>
-    </w:p>
-    <w:p>
-      <w:pPr>
-        <w:pStyle w:val="BodyText"/>
-      </w:pPr>
-      <w:r>
-        <w:t xml:space="preserve">Associado à Auditoria Interna</w:t>
-      </w:r>
-    </w:p>
-    <w:p>
-      <w:pPr>
-        <w:pStyle w:val="BodyText"/>
-      </w:pPr>
-      <w:r>
-        <w:t xml:space="preserve">Analista de Riscos de Terceiros</w:t>
-      </w:r>
-    </w:p>
-    <w:p>
-      <w:pPr>
-        <w:pStyle w:val="BodyText"/>
-      </w:pPr>
-      <w:r>
-        <w:t xml:space="preserve">Analista de Garantia de Segurança</w:t>
-      </w:r>
-    </w:p>
-    <w:bookmarkEnd w:id="101"/>
-    <w:bookmarkStart w:id="102" w:name="típico-trabalho-júnior"/>
+      <w:r>
+        <w:t xml:space="preserve">Competência** Prova**</w:t>
+      </w:r>
+      <w:r>
+        <w:t xml:space="preserve"> </w:t>
+      </w:r>
+      <w:r>
+        <w:t xml:space="preserve">—————————————————————————————————————– (———————————————————————————————————————————————————————————-</w:t>
+      </w:r>
+      <w:r>
+        <w:t xml:space="preserve"> </w:t>
+      </w:r>
+      <w:r>
+        <w:t xml:space="preserve">Os conceitos do ISMS explicam as cláusulas 4–10 e a melhoria contínua</w:t>
+      </w:r>
+      <w:r>
+        <w:t xml:space="preserve"> </w:t>
+      </w:r>
+      <w:r>
+        <w:t xml:space="preserve">• Risco • Criar um plano de registo e tratamento consistente</w:t>
+      </w:r>
+      <w:r>
+        <w:t xml:space="preserve"> </w:t>
+      </w:r>
+      <w:r>
+        <w:t xml:space="preserve">(SoA) Justifique seleções, exclusões, status e evidências ,</w:t>
+      </w:r>
+      <w:r>
+        <w:t xml:space="preserve"> </w:t>
+      </w:r>
+      <w:r>
+        <w:t xml:space="preserve">• Teste de evidência; Defina populações, amostras, procedimentos, exceções e retestes;</w:t>
+      </w:r>
+      <w:r>
+        <w:t xml:space="preserve"> </w:t>
+      </w:r>
+      <w:r>
+        <w:t xml:space="preserve">□ Alfabetização técnica; Interpretar identidade, nuvem, registro, vulnerabilidade, backup e evidência de configuração;</w:t>
+      </w:r>
+      <w:r>
+        <w:t xml:space="preserve"> </w:t>
+      </w:r>
+      <w:r>
+        <w:t xml:space="preserve">• Comunicação • Escrever conclusões concisas, acções e resumos de gestão</w:t>
+      </w:r>
+      <w:r>
+        <w:t xml:space="preserve"> </w:t>
+      </w:r>
+      <w:r>
+        <w:t xml:space="preserve">Ético Use dados sintéticos, sistemas autorizados e alegações honestas</w:t>
+      </w:r>
+    </w:p>
+    <w:bookmarkEnd w:id="130"/>
+    <w:bookmarkStart w:id="131" w:name="laboratório-fictício-e-portfólio"/>
     <w:p>
       <w:pPr>
         <w:pStyle w:val="Heading1"/>
       </w:pPr>
       <w:r>
-        <w:t xml:space="preserve"># 24,1 Típico trabalho júnior</w:t>
-      </w:r>
-    </w:p>
-    <w:p>
-      <w:pPr>
-        <w:numPr>
-          <w:ilvl w:val="0"/>
-          <w:numId w:val="1034"/>
-        </w:numPr>
-      </w:pPr>
-      <w:r>
-        <w:t xml:space="preserve">Manter escopo, ativo, obrigação, fornecedor, risco, controle, SoA, evidências, achados e registros de ação.</w:t>
-      </w:r>
-    </w:p>
-    <w:p>
-      <w:pPr>
-        <w:numPr>
-          <w:ilvl w:val="0"/>
-          <w:numId w:val="1034"/>
-        </w:numPr>
-      </w:pPr>
-      <w:r>
-        <w:t xml:space="preserve">Recolha provas sem alterar os registos e valide a integralidade.</w:t>
-      </w:r>
-    </w:p>
-    <w:p>
-      <w:pPr>
-        <w:numPr>
-          <w:ilvl w:val="0"/>
-          <w:numId w:val="1034"/>
-        </w:numPr>
-      </w:pPr>
-      <w:r>
-        <w:t xml:space="preserve">Mapa riscos e requisitos para controles, proprietários, procedimentos, sistemas e provas.</w:t>
-      </w:r>
-    </w:p>
-    <w:p>
-      <w:pPr>
-        <w:numPr>
-          <w:ilvl w:val="0"/>
-          <w:numId w:val="1034"/>
-        </w:numPr>
-      </w:pPr>
-      <w:r>
-        <w:t xml:space="preserve">Teste amostras de acesso, mudança, vulnerabilidade, incidente, backup, fornecedor, consciência, física e controles de continuidade.</w:t>
-      </w:r>
-    </w:p>
-    <w:p>
-      <w:pPr>
-        <w:numPr>
-          <w:ilvl w:val="0"/>
-          <w:numId w:val="1034"/>
-        </w:numPr>
-      </w:pPr>
-      <w:r>
-        <w:t xml:space="preserve">Apoiar auditorias internas, análises de gestão, métricas, ações corretivas e preparação de certificação.</w:t>
-      </w:r>
-    </w:p>
-    <w:p>
-      <w:pPr>
-        <w:numPr>
-          <w:ilvl w:val="0"/>
-          <w:numId w:val="1034"/>
-        </w:numPr>
-      </w:pPr>
-      <w:r>
-        <w:t xml:space="preserve">Escreva conclusões factuais e divulgue limitações de amostragem, escopo e provas.</w:t>
-      </w:r>
-    </w:p>
-    <w:p>
-      <w:pPr>
-        <w:numPr>
-          <w:ilvl w:val="0"/>
-          <w:numId w:val="1034"/>
-        </w:numPr>
-      </w:pPr>
-      <w:r>
-        <w:t xml:space="preserve">Proteger informações confidenciais e permanecer dentro da autorização.</w:t>
-      </w:r>
-    </w:p>
-    <w:bookmarkEnd w:id="102"/>
-    <w:bookmarkStart w:id="103" w:name="valor-dos-empregadores-de-competências"/>
+        <w:t xml:space="preserve">25. Laboratório Fictício e Portfólio</w:t>
+      </w:r>
+    </w:p>
+    <w:p>
+      <w:pPr>
+        <w:numPr>
+          <w:ilvl w:val="0"/>
+          <w:numId w:val="1035"/>
+        </w:numPr>
+        <w:pStyle w:val="Compact"/>
+      </w:pPr>
+      <w:r>
+        <w:t xml:space="preserve">Um ambiente de prática segura usando dados sintéticos e sistemas de laboratório autorizados.*</w:t>
+      </w:r>
+    </w:p>
+    <w:p>
+      <w:pPr>
+        <w:pStyle w:val="FirstParagraph"/>
+      </w:pPr>
+      <w:r>
+        <w:t xml:space="preserve">Regra do laboratório:** Use uma organização fictícia, dados sintéticos, sistemas isolados e ferramentas que você está autorizado a operar. Não afirme que um projeto de portfólio é uma certificação real ou auditoria do cliente. □</w:t>
+      </w:r>
+      <w:r>
+        <w:t xml:space="preserve"> </w:t>
+      </w:r>
+      <w:r>
+        <w:t xml:space="preserve">□—————————————————————————————————————————————————————————————————————————————————————————————————————–</w:t>
+      </w:r>
+    </w:p>
+    <w:p>
+      <w:pPr>
+        <w:numPr>
+          <w:ilvl w:val="0"/>
+          <w:numId w:val="1036"/>
+        </w:numPr>
+      </w:pPr>
+      <w:r>
+        <w:t xml:space="preserve">Criar uma empresa fictícia com dois produtos, um serviço de nuvem, uma força de trabalho remota, e três fornecedores.</w:t>
+      </w:r>
+    </w:p>
+    <w:p>
+      <w:pPr>
+        <w:numPr>
+          <w:ilvl w:val="0"/>
+          <w:numId w:val="1036"/>
+        </w:numPr>
+      </w:pPr>
+      <w:r>
+        <w:t xml:space="preserve">Escreva uma análise de contexto de uma página, registro do partido interessado, determinação da relevância do clima e declaração do escopo.</w:t>
+      </w:r>
+    </w:p>
+    <w:p>
+      <w:pPr>
+        <w:numPr>
+          <w:ilvl w:val="0"/>
+          <w:numId w:val="1036"/>
+        </w:numPr>
+      </w:pPr>
+      <w:r>
+        <w:t xml:space="preserve">Criar critérios de risco e um registro de risco de dez cenários com proprietários e decisões de tratamento.</w:t>
+      </w:r>
+    </w:p>
+    <w:p>
+      <w:pPr>
+        <w:numPr>
+          <w:ilvl w:val="0"/>
+          <w:numId w:val="1036"/>
+        </w:numPr>
+      </w:pPr>
+      <w:r>
+        <w:t xml:space="preserve">Criar um plano de tratamento e SoA que aborda todos os 93 controles Anexo A com justificativas concisas e estado de implementação honesto.</w:t>
+      </w:r>
+    </w:p>
+    <w:p>
+      <w:pPr>
+        <w:numPr>
+          <w:ilvl w:val="0"/>
+          <w:numId w:val="1036"/>
+        </w:numPr>
+      </w:pPr>
+      <w:r>
+        <w:t xml:space="preserve">Construa políticas de amostragem, procedimentos, objetivos, métricas, registros de ativos e fornecedores, registro de treinamento, registro de incidentes e exercício de continuidade.</w:t>
+      </w:r>
+    </w:p>
+    <w:p>
+      <w:pPr>
+        <w:numPr>
+          <w:ilvl w:val="0"/>
+          <w:numId w:val="1036"/>
+        </w:numPr>
+      </w:pPr>
+      <w:r>
+        <w:t xml:space="preserve">Use algumas ferramentas de código aberto em laboratórios isolados e capturar escopo, configuração, resultados, validação, remediação e evidências de reteste.</w:t>
+      </w:r>
+    </w:p>
+    <w:p>
+      <w:pPr>
+        <w:numPr>
+          <w:ilvl w:val="0"/>
+          <w:numId w:val="1036"/>
+        </w:numPr>
+      </w:pPr>
+      <w:r>
+        <w:t xml:space="preserve">Projete e execute um plano de auditoria interna contra cláusulas e controles selecionados.</w:t>
+      </w:r>
+    </w:p>
+    <w:p>
+      <w:pPr>
+        <w:numPr>
+          <w:ilvl w:val="0"/>
+          <w:numId w:val="1036"/>
+        </w:numPr>
+      </w:pPr>
+      <w:r>
+        <w:t xml:space="preserve">Escreva duas não conformidades, registros de causa raiz, ações corretivas e testes de eficácia.</w:t>
+      </w:r>
+    </w:p>
+    <w:p>
+      <w:pPr>
+        <w:numPr>
+          <w:ilvl w:val="0"/>
+          <w:numId w:val="1036"/>
+        </w:numPr>
+      </w:pPr>
+      <w:r>
+        <w:t xml:space="preserve">Crie minutos de gerenciamento-revisão mostrando entradas, decisões, proprietários, recursos e prazos.</w:t>
+      </w:r>
+    </w:p>
+    <w:p>
+      <w:pPr>
+        <w:numPr>
+          <w:ilvl w:val="0"/>
+          <w:numId w:val="1036"/>
+        </w:numPr>
+      </w:pPr>
+      <w:r>
+        <w:t xml:space="preserve">Publique somente artefatos sintéticos e higienizados, com uma declaração clara de limitações.</w:t>
+      </w:r>
+    </w:p>
+    <w:p>
+      <w:pPr>
+        <w:pStyle w:val="FirstParagraph"/>
+      </w:pPr>
+      <w:r>
+        <w:t xml:space="preserve">O artefato de Portfólio** O que demonstra**</w:t>
+      </w:r>
+      <w:r>
+        <w:t xml:space="preserve"> </w:t>
+      </w:r>
+      <w:r>
+        <w:t xml:space="preserve">□——————————————————————————————————————</w:t>
+      </w:r>
+      <w:r>
+        <w:t xml:space="preserve"> </w:t>
+      </w:r>
+      <w:r>
+        <w:t xml:space="preserve">Contexto, partidos, escopo . Cláusula 4 raciocínio e limites .</w:t>
+      </w:r>
+      <w:r>
+        <w:t xml:space="preserve"> </w:t>
+      </w:r>
+      <w:r>
+        <w:t xml:space="preserve">• Método de risco, registo, tratamento</w:t>
+      </w:r>
+      <w:r>
+        <w:t xml:space="preserve"> </w:t>
+      </w:r>
+      <w:r>
+        <w:t xml:space="preserve">□ Declaração de aplicabilidade</w:t>
+      </w:r>
+      <w:r>
+        <w:t xml:space="preserve"> </w:t>
+      </w:r>
+      <w:r>
+        <w:t xml:space="preserve">□ Controle papel de teste □ Evidência, amostragem, exceção e conclusão</w:t>
+      </w:r>
+      <w:r>
+        <w:t xml:space="preserve"> </w:t>
+      </w:r>
+      <w:r>
+        <w:t xml:space="preserve">Programa, plano, critérios, relatório e acompanhamento</w:t>
+      </w:r>
+      <w:r>
+        <w:t xml:space="preserve"> </w:t>
+      </w:r>
+      <w:r>
+        <w:t xml:space="preserve">□ Minutos de análise de gestão</w:t>
+      </w:r>
+      <w:r>
+        <w:t xml:space="preserve"> </w:t>
+      </w:r>
+      <w:r>
+        <w:t xml:space="preserve">• Registo de acção correctiva</w:t>
+      </w:r>
+      <w:r>
+        <w:t xml:space="preserve"> </w:t>
+      </w:r>
+      <w:r>
+        <w:t xml:space="preserve">O Memorando de evidência da ferramenta O Alfabetismo técnico e limitações</w:t>
+      </w:r>
+    </w:p>
+    <w:bookmarkEnd w:id="131"/>
+    <w:bookmarkStart w:id="133" w:name="plano-de-aprendizagem-de-trinta-dias"/>
     <w:p>
       <w:pPr>
         <w:pStyle w:val="Heading1"/>
       </w:pPr>
       <w:r>
-        <w:t xml:space="preserve"># 24.2 Valor dos empregadores de competências</w:t>
+        <w:t xml:space="preserve">26. Plano de Aprendizagem de Trinta Dias</w:t>
+      </w:r>
+    </w:p>
+    <w:p>
+      <w:pPr>
+        <w:numPr>
+          <w:ilvl w:val="0"/>
+          <w:numId w:val="1037"/>
+        </w:numPr>
+      </w:pPr>
+      <w:r>
+        <w:t xml:space="preserve">Uma programação focada para a construção de capacidade de nível júnior útil.*</w:t>
+      </w:r>
+    </w:p>
+    <w:p>
+      <w:pPr>
+        <w:numPr>
+          <w:ilvl w:val="0"/>
+          <w:numId w:val="1037"/>
+        </w:numPr>
+        <w:pStyle w:val="Heading2"/>
+      </w:pPr>
+      <w:bookmarkStart w:id="132" w:name="dias-foco-entrega"/>
+      <w:r>
+        <w:t xml:space="preserve">Dias** * Foco** * Entrega**</w:t>
+      </w:r>
+      <w:bookmarkEnd w:id="132"/>
+    </w:p>
+    <w:p>
+      <w:pPr>
+        <w:numPr>
+          <w:ilvl w:val="0"/>
+          <w:numId w:val="1000"/>
+        </w:numPr>
+      </w:pPr>
+      <w:r>
+        <w:t xml:space="preserve">1–5 ISMS, CIA, cláusulas, ISO 27001/27002 relação, âmbito de aplicação</w:t>
+      </w:r>
+      <w:r>
+        <w:t xml:space="preserve"> </w:t>
+      </w:r>
+      <w:r>
+        <w:t xml:space="preserve">• 6–10 • Critérios de risco, cenários, avaliação, tratamento, aceitação</w:t>
+      </w:r>
+      <w:r>
+        <w:t xml:space="preserve"> </w:t>
+      </w:r>
+      <w:r>
+        <w:t xml:space="preserve">Os temas do Anexo A e a Declaração de Aplicabilidade</w:t>
+      </w:r>
+      <w:r>
+        <w:t xml:space="preserve"> </w:t>
+      </w:r>
+      <w:r>
+        <w:t xml:space="preserve">15–18 Políticas, competência, comunicação, controle de documentos, operações</w:t>
+      </w:r>
+      <w:r>
+        <w:t xml:space="preserve"> </w:t>
+      </w:r>
+      <w:r>
+        <w:t xml:space="preserve">□ 19–22 □ Métricas, monitorização, auditoria interna, revisão da gestão</w:t>
+      </w:r>
+      <w:r>
+        <w:t xml:space="preserve"> </w:t>
+      </w:r>
+      <w:r>
+        <w:t xml:space="preserve">23–25; Não conformidade, causa raiz, ação corretiva, melhoria; Dois registros de achados e ação corretiva;</w:t>
+      </w:r>
+      <w:r>
+        <w:t xml:space="preserve"> </w:t>
+      </w:r>
+      <w:r>
+        <w:t xml:space="preserve">26–28 Laboratórios de ferramentas de código aberto autorizados Dois memorandos de evidência e reteste</w:t>
+      </w:r>
+      <w:r>
+        <w:t xml:space="preserve"> </w:t>
+      </w:r>
+      <w:r>
+        <w:t xml:space="preserve">29–30 □ Limpeza e prática de entrevista de carteiras</w:t>
+      </w:r>
+    </w:p>
+    <w:bookmarkEnd w:id="133"/>
+    <w:bookmarkStart w:id="135" w:name="preparação-da-entrevista"/>
+    <w:p>
+      <w:pPr>
+        <w:pStyle w:val="Heading1"/>
+      </w:pPr>
+      <w:r>
+        <w:t xml:space="preserve">27. Preparação da entrevista</w:t>
+      </w:r>
+    </w:p>
+    <w:p>
+      <w:pPr>
+        <w:numPr>
+          <w:ilvl w:val="0"/>
+          <w:numId w:val="1038"/>
+        </w:numPr>
+        <w:pStyle w:val="Compact"/>
+      </w:pPr>
+      <w:r>
+        <w:t xml:space="preserve">Respostas claras, cenários práticos e perguntas para o empregador.*</w:t>
+      </w:r>
+    </w:p>
+    <w:bookmarkStart w:id="134" w:name="o-que-é-um-isms"/>
+    <w:p>
+      <w:pPr>
+        <w:pStyle w:val="Heading2"/>
+      </w:pPr>
+      <w:r>
+        <w:t xml:space="preserve">27.1 O que é um ISMS?</w:t>
       </w:r>
     </w:p>
     <w:p>
@@ -5257,77 +6064,460 @@
         <w:pStyle w:val="FirstParagraph"/>
       </w:pPr>
       <w:r>
-        <w:t xml:space="preserve">Competência** Prova**</w:t>
-      </w:r>
-      <w:r>
-        <w:t xml:space="preserve"> </w:t>
-      </w:r>
-      <w:r>
-        <w:t xml:space="preserve">—————————————————————————————————————– (———————————————————————————————————————————————————————————-</w:t>
-      </w:r>
-      <w:r>
-        <w:t xml:space="preserve"> </w:t>
-      </w:r>
-      <w:r>
-        <w:t xml:space="preserve">Os conceitos do ISMS explicam as cláusulas 4–10 e a melhoria contínua</w:t>
-      </w:r>
-      <w:r>
-        <w:t xml:space="preserve"> </w:t>
-      </w:r>
-      <w:r>
-        <w:t xml:space="preserve">• Risco • Criar um plano de registo e tratamento consistente</w:t>
-      </w:r>
-      <w:r>
-        <w:t xml:space="preserve"> </w:t>
-      </w:r>
-      <w:r>
-        <w:t xml:space="preserve">(SoA) Justifique seleções, exclusões, status e evidências ,</w:t>
-      </w:r>
-      <w:r>
-        <w:t xml:space="preserve"> </w:t>
-      </w:r>
-      <w:r>
-        <w:t xml:space="preserve">• Teste de evidência; Defina populações, amostras, procedimentos, exceções e retestes;</w:t>
-      </w:r>
-      <w:r>
-        <w:t xml:space="preserve"> </w:t>
-      </w:r>
-      <w:r>
-        <w:t xml:space="preserve">□ Alfabetização técnica; Interpretar identidade, nuvem, registro, vulnerabilidade, backup e evidência de configuração;</w:t>
-      </w:r>
-      <w:r>
-        <w:t xml:space="preserve"> </w:t>
-      </w:r>
-      <w:r>
-        <w:t xml:space="preserve">• Comunicação • Escrever conclusões concisas, acções e resumos de gestão</w:t>
-      </w:r>
-      <w:r>
-        <w:t xml:space="preserve"> </w:t>
-      </w:r>
-      <w:r>
-        <w:t xml:space="preserve">Ético Use dados sintéticos, sistemas autorizados e alegações honestas</w:t>
-      </w:r>
-    </w:p>
-    <w:bookmarkEnd w:id="103"/>
-    <w:bookmarkStart w:id="104" w:name="laboratório-fictício-e-portfólio"/>
+        <w:t xml:space="preserve">Um sistema de gestão para controlar o risco de segurança da informação através de liderança, planejamento, operação, avaliação e melhoria contínua.</w:t>
+      </w:r>
+    </w:p>
+    <w:bookmarkEnd w:id="134"/>
+    <w:bookmarkEnd w:id="135"/>
+    <w:bookmarkStart w:id="136" w:name="iso-27001-versus-27002"/>
     <w:p>
       <w:pPr>
         <w:pStyle w:val="Heading1"/>
       </w:pPr>
       <w:r>
-        <w:t xml:space="preserve">25. Laboratório Fictício e Portfólio</w:t>
-      </w:r>
-    </w:p>
-    <w:p>
-      <w:pPr>
-        <w:numPr>
-          <w:ilvl w:val="0"/>
-          <w:numId w:val="1035"/>
+        <w:t xml:space="preserve"># 27,2 ISO 27001 versus 27002?</w:t>
+      </w:r>
+    </w:p>
+    <w:p>
+      <w:pPr>
+        <w:pStyle w:val="FirstParagraph"/>
+      </w:pPr>
+      <w:r>
+        <w:t xml:space="preserve">27001 contém requisitos ISMS certificados; 27002 fornece orientação de controle detalhada e não é em si uma norma de certificação.</w:t>
+      </w:r>
+    </w:p>
+    <w:bookmarkEnd w:id="136"/>
+    <w:bookmarkStart w:id="138" w:name="o-que-é-o-soa"/>
+    <w:p>
+      <w:pPr>
+        <w:pStyle w:val="Heading1"/>
+      </w:pPr>
+      <w:r>
+        <w:t xml:space="preserve"># 27.3 O que é o SoA?</w:t>
+      </w:r>
+    </w:p>
+    <w:p>
+      <w:pPr>
+        <w:pStyle w:val="FirstParagraph"/>
+      </w:pPr>
+      <w:r>
+        <w:t xml:space="preserve">Um registo controlado dos controlos necessários, a justificação da inclusão ou exclusão no anexo A e o estado de execução, ligados ao tratamento e às provas.</w:t>
+      </w:r>
+    </w:p>
+    <w:bookmarkStart w:id="137" w:name="Xd7a94282af627341903619724c786ba476635e4"/>
+    <w:p>
+      <w:pPr>
+        <w:pStyle w:val="Heading2"/>
+      </w:pPr>
+      <w:r>
+        <w:t xml:space="preserve">27.4 Todos os controles do Anexo A são obrigatórios?</w:t>
+      </w:r>
+    </w:p>
+    <w:p>
+      <w:pPr>
+        <w:pStyle w:val="FirstParagraph"/>
+      </w:pPr>
+      <w:r>
+        <w:t xml:space="preserve">A organização deve utilizar o anexo A como verificação de referência e justificar as decisões. Controles necessários seguem tratamento de risco e obrigações; outros controles também podem ser necessários.</w:t>
+      </w:r>
+    </w:p>
+    <w:bookmarkEnd w:id="137"/>
+    <w:bookmarkEnd w:id="138"/>
+    <w:bookmarkStart w:id="139" w:name="como-se-testa-um-controle"/>
+    <w:p>
+      <w:pPr>
+        <w:pStyle w:val="Heading1"/>
+      </w:pPr>
+      <w:r>
+        <w:t xml:space="preserve"># 27.5 Como se testa um controle?</w:t>
+      </w:r>
+    </w:p>
+    <w:p>
+      <w:pPr>
+        <w:pStyle w:val="FirstParagraph"/>
+      </w:pPr>
+      <w:r>
+        <w:t xml:space="preserve">Defina critérios e escopo, valide a população, amostra por risco, inspecione e reperforme evidências, exceções documentais e correção de reteste.</w:t>
+      </w:r>
+    </w:p>
+    <w:bookmarkEnd w:id="139"/>
+    <w:bookmarkStart w:id="140" w:name="o-que-é-uma-não-conformidade"/>
+    <w:p>
+      <w:pPr>
+        <w:pStyle w:val="Heading1"/>
+      </w:pPr>
+      <w:r>
+        <w:t xml:space="preserve"># 27.6 O que é uma não conformidade?</w:t>
+      </w:r>
+    </w:p>
+    <w:p>
+      <w:pPr>
+        <w:pStyle w:val="FirstParagraph"/>
+      </w:pPr>
+      <w:r>
+        <w:t xml:space="preserve">Falha em cumprir uma exigência. Requer correção, avaliação, ação adequada e revisão de efetividade.</w:t>
+      </w:r>
+    </w:p>
+    <w:bookmarkEnd w:id="140"/>
+    <w:bookmarkStart w:id="141" w:name="o-que-mudou-em-2024"/>
+    <w:p>
+      <w:pPr>
+        <w:pStyle w:val="Heading1"/>
+      </w:pPr>
+      <w:r>
+        <w:t xml:space="preserve"># 27.7 O que mudou em 2024?</w:t>
+      </w:r>
+    </w:p>
+    <w:p>
+      <w:pPr>
+        <w:pStyle w:val="FirstParagraph"/>
+      </w:pPr>
+      <w:r>
+        <w:t xml:space="preserve">A alteração exige uma consideração explícita da relevância das alterações climáticas no contexto e observa que as partes interessadas podem ter requisitos relacionados com o clima.</w:t>
+      </w:r>
+    </w:p>
+    <w:bookmarkEnd w:id="141"/>
+    <w:bookmarkStart w:id="142" w:name="X6af7a3d625a0b1807a794f98499926755a55a0d"/>
+    <w:p>
+      <w:pPr>
+        <w:pStyle w:val="Heading1"/>
+      </w:pPr>
+      <w:r>
+        <w:t xml:space="preserve"># 27.8 O que pode um analista júnior concluir com segurança?</w:t>
+      </w:r>
+    </w:p>
+    <w:p>
+      <w:pPr>
+        <w:pStyle w:val="FirstParagraph"/>
+      </w:pPr>
+      <w:r>
+        <w:t xml:space="preserve">Factos estatais apoiados por elementos de prova e âmbito definidos, divulgar limitações e evitar reclamar a autoridade de auditoria ou certificação.</w:t>
+      </w:r>
+    </w:p>
+    <w:bookmarkEnd w:id="142"/>
+    <w:bookmarkStart w:id="143" w:name="perguntas-para-perguntar-ao-empregador"/>
+    <w:p>
+      <w:pPr>
+        <w:pStyle w:val="Heading1"/>
+      </w:pPr>
+      <w:r>
+        <w:t xml:space="preserve"># 27.9 Perguntas para perguntar ao empregador</w:t>
+      </w:r>
+    </w:p>
+    <w:p>
+      <w:pPr>
+        <w:numPr>
+          <w:ilvl w:val="0"/>
+          <w:numId w:val="1039"/>
+        </w:numPr>
+      </w:pPr>
+      <w:r>
+        <w:t xml:space="preserve">Qual é o escopo ISMS certificado ou pretendido?</w:t>
+      </w:r>
+    </w:p>
+    <w:p>
+      <w:pPr>
+        <w:numPr>
+          <w:ilvl w:val="0"/>
+          <w:numId w:val="1039"/>
+        </w:numPr>
+      </w:pPr>
+      <w:r>
+        <w:t xml:space="preserve">Quem é o dono da aceitação do risco e do SoA?</w:t>
+      </w:r>
+    </w:p>
+    <w:p>
+      <w:pPr>
+        <w:numPr>
+          <w:ilvl w:val="0"/>
+          <w:numId w:val="1039"/>
+        </w:numPr>
+      </w:pPr>
+      <w:r>
+        <w:t xml:space="preserve">Como as populações de evidência são produzidas e validadas?</w:t>
+      </w:r>
+    </w:p>
+    <w:p>
+      <w:pPr>
+        <w:numPr>
+          <w:ilvl w:val="0"/>
+          <w:numId w:val="1039"/>
+        </w:numPr>
+      </w:pPr>
+      <w:r>
+        <w:t xml:space="preserve">Que sistemas gerem riscos, controlos, fornecedores, resultados e medidas correctivas?</w:t>
+      </w:r>
+    </w:p>
+    <w:p>
+      <w:pPr>
+        <w:numPr>
+          <w:ilvl w:val="0"/>
+          <w:numId w:val="1039"/>
+        </w:numPr>
+      </w:pPr>
+      <w:r>
+        <w:t xml:space="preserve">Como é mantida a independência do auditor interno?</w:t>
+      </w:r>
+    </w:p>
+    <w:p>
+      <w:pPr>
+        <w:numPr>
+          <w:ilvl w:val="0"/>
+          <w:numId w:val="1039"/>
+        </w:numPr>
+      </w:pPr>
+      <w:r>
+        <w:t xml:space="preserve">Com que equipas técnicas trabalhará este papel?</w:t>
+      </w:r>
+    </w:p>
+    <w:p>
+      <w:pPr>
+        <w:numPr>
+          <w:ilvl w:val="0"/>
+          <w:numId w:val="1039"/>
+        </w:numPr>
+      </w:pPr>
+      <w:r>
+        <w:t xml:space="preserve">Como as conclusões júnior são revistas e treinadas?</w:t>
+      </w:r>
+    </w:p>
+    <w:bookmarkEnd w:id="143"/>
+    <w:bookmarkStart w:id="144" w:name="modelos-glossário-índice-e-referências"/>
+    <w:p>
+      <w:pPr>
+        <w:pStyle w:val="Heading1"/>
+      </w:pPr>
+      <w:r>
+        <w:t xml:space="preserve">28. Modelos, Glossário, Índice e Referências</w:t>
+      </w:r>
+    </w:p>
+    <w:p>
+      <w:pPr>
+        <w:numPr>
+          <w:ilvl w:val="0"/>
+          <w:numId w:val="1040"/>
         </w:numPr>
         <w:pStyle w:val="Compact"/>
       </w:pPr>
       <w:r>
-        <w:t xml:space="preserve">Um ambiente de prática segura usando dados sintéticos e sistemas de laboratório autorizados.*</w:t>
+        <w:t xml:space="preserve">Estruturas de trabalho reutilizáveis, termos importantes e pontos de partida autoritários.*</w:t>
+      </w:r>
+    </w:p>
+    <w:bookmarkEnd w:id="144"/>
+    <w:bookmarkStart w:id="146" w:name="registro-de-risco-mínimo"/>
+    <w:p>
+      <w:pPr>
+        <w:pStyle w:val="Heading1"/>
+      </w:pPr>
+      <w:r>
+        <w:t xml:space="preserve"># 28.1 Registro de risco mínimo</w:t>
+      </w:r>
+    </w:p>
+    <w:p>
+      <w:pPr>
+        <w:numPr>
+          <w:ilvl w:val="0"/>
+          <w:numId w:val="1041"/>
+        </w:numPr>
+        <w:pStyle w:val="Heading2"/>
+      </w:pPr>
+      <w:bookmarkStart w:id="145" w:name="campo-entrada"/>
+      <w:r>
+        <w:t xml:space="preserve">Campo** * Entrada**</w:t>
+      </w:r>
+      <w:bookmarkEnd w:id="145"/>
+    </w:p>
+    <w:p>
+      <w:pPr>
+        <w:numPr>
+          <w:ilvl w:val="0"/>
+          <w:numId w:val="1000"/>
+        </w:numPr>
+        <w:pStyle w:val="Compact"/>
+      </w:pPr>
+      <w:r>
+        <w:t xml:space="preserve">ID de risco e proprietário</w:t>
+      </w:r>
+      <w:r>
+        <w:t xml:space="preserve"> </w:t>
+      </w:r>
+      <w:r>
+        <w:t xml:space="preserve">Objectivo / activo</w:t>
+      </w:r>
+      <w:r>
+        <w:t xml:space="preserve"> </w:t>
+      </w:r>
+      <w:r>
+        <w:t xml:space="preserve">“</w:t>
+      </w:r>
+      <w:r>
+        <w:t xml:space="preserve">Evento e condição de ameaça</w:t>
+      </w:r>
+      <w:r>
+        <w:t xml:space="preserve">”</w:t>
+      </w:r>
+      <w:r>
+        <w:t xml:space="preserve"> </w:t>
+      </w:r>
+      <w:r>
+        <w:t xml:space="preserve">Consequências</w:t>
+      </w:r>
+      <w:r>
+        <w:t xml:space="preserve"> </w:t>
+      </w:r>
+      <w:r>
+        <w:t xml:space="preserve">Controlos existentes</w:t>
+      </w:r>
+    </w:p>
+    <w:p>
+      <w:pPr>
+        <w:numPr>
+          <w:ilvl w:val="0"/>
+          <w:numId w:val="1041"/>
+        </w:numPr>
+        <w:pStyle w:val="Compact"/>
+      </w:pPr>
+      <w:r>
+        <w:t xml:space="preserve">Litígio e impacto</w:t>
+      </w:r>
+      <w:r>
+        <w:t xml:space="preserve"> </w:t>
+      </w:r>
+      <w:r>
+        <w:t xml:space="preserve">O risco actual</w:t>
+      </w:r>
+      <w:r>
+        <w:t xml:space="preserve"> </w:t>
+      </w:r>
+      <w:r>
+        <w:t xml:space="preserve">O titular do tratamento e da acção □                                 </w:t>
+      </w:r>
+      <w:r>
+        <w:t xml:space="preserve"> </w:t>
+      </w:r>
+      <w:r>
+        <w:t xml:space="preserve">Risco residual e aceitação</w:t>
+      </w:r>
+      <w:r>
+        <w:t xml:space="preserve"> </w:t>
+      </w:r>
+      <w:r>
+        <w:t xml:space="preserve">Data de revisão</w:t>
+      </w:r>
+    </w:p>
+    <w:bookmarkEnd w:id="146"/>
+    <w:bookmarkStart w:id="148" w:name="papel-de-teste-de-controle"/>
+    <w:p>
+      <w:pPr>
+        <w:pStyle w:val="Heading1"/>
+      </w:pPr>
+      <w:r>
+        <w:t xml:space="preserve"># 28.2 Papel de teste de controle</w:t>
+      </w:r>
+    </w:p>
+    <w:p>
+      <w:pPr>
+        <w:numPr>
+          <w:ilvl w:val="0"/>
+          <w:numId w:val="1042"/>
+        </w:numPr>
+        <w:pStyle w:val="Heading2"/>
+      </w:pPr>
+      <w:bookmarkStart w:id="147" w:name="campo-entrada-1"/>
+      <w:r>
+        <w:t xml:space="preserve">Campo** * Entrada**</w:t>
+      </w:r>
+      <w:bookmarkEnd w:id="147"/>
+    </w:p>
+    <w:p>
+      <w:pPr>
+        <w:numPr>
+          <w:ilvl w:val="0"/>
+          <w:numId w:val="1000"/>
+        </w:numPr>
+        <w:pStyle w:val="Compact"/>
+      </w:pPr>
+      <w:r>
+        <w:t xml:space="preserve">• Critérios e controlo</w:t>
+      </w:r>
+      <w:r>
+        <w:t xml:space="preserve"> </w:t>
+      </w:r>
+      <w:r>
+        <w:t xml:space="preserve">Âmbito de aplicação e período</w:t>
+      </w:r>
+      <w:r>
+        <w:t xml:space="preserve"> </w:t>
+      </w:r>
+      <w:r>
+        <w:t xml:space="preserve">• Proprietário e sistemas</w:t>
+      </w:r>
+      <w:r>
+        <w:t xml:space="preserve"> </w:t>
+      </w:r>
+      <w:r>
+        <w:t xml:space="preserve">• Verificação da população e da completude</w:t>
+      </w:r>
+      <w:r>
+        <w:t xml:space="preserve"> </w:t>
+      </w:r>
+      <w:r>
+        <w:t xml:space="preserve">Exemplo e justificação</w:t>
+      </w:r>
+      <w:r>
+        <w:t xml:space="preserve"> </w:t>
+      </w:r>
+      <w:r>
+        <w:t xml:space="preserve">Procedimento realizado</w:t>
+      </w:r>
+      <w:r>
+        <w:t xml:space="preserve"> </w:t>
+      </w:r>
+      <w:r>
+        <w:t xml:space="preserve">• Provas inspeccionadas</w:t>
+      </w:r>
+      <w:r>
+        <w:t xml:space="preserve"> </w:t>
+      </w:r>
+      <w:r>
+        <w:t xml:space="preserve">Excepções</w:t>
+      </w:r>
+      <w:r>
+        <w:t xml:space="preserve"> </w:t>
+      </w:r>
+      <w:r>
+        <w:t xml:space="preserve">Conclusão e limitação</w:t>
+      </w:r>
+    </w:p>
+    <w:p>
+      <w:pPr>
+        <w:numPr>
+          <w:ilvl w:val="0"/>
+          <w:numId w:val="1042"/>
+        </w:numPr>
+        <w:pStyle w:val="Compact"/>
+      </w:pPr>
+      <w:r>
+        <w:t xml:space="preserve">Correcção e reteste</w:t>
+      </w:r>
+    </w:p>
+    <w:bookmarkEnd w:id="148"/>
+    <w:bookmarkStart w:id="150" w:name="glossário"/>
+    <w:p>
+      <w:pPr>
+        <w:pStyle w:val="Heading1"/>
+      </w:pPr>
+      <w:r>
+        <w:t xml:space="preserve"># 28.3 Glossário</w:t>
+      </w:r>
+    </w:p>
+    <w:bookmarkStart w:id="149" w:name="section-2"/>
+    <w:p>
+      <w:pPr>
+        <w:pStyle w:val="Heading2"/>
+      </w:pPr>
+      <w:r>
+        <w:t xml:space="preserve">* ** ** ** ** ** ** **</w:t>
       </w:r>
     </w:p>
     <w:p>
@@ -5335,859 +6525,93 @@
         <w:pStyle w:val="FirstParagraph"/>
       </w:pPr>
       <w:r>
-        <w:t xml:space="preserve">Regra do laboratório:** Use uma organização fictícia, dados sintéticos, sistemas isolados e ferramentas que você está autorizado a operar. Não afirme que um projeto de portfólio é uma certificação real ou auditoria do cliente. □</w:t>
-      </w:r>
-      <w:r>
-        <w:t xml:space="preserve"> </w:t>
-      </w:r>
-      <w:r>
-        <w:t xml:space="preserve">□—————————————————————————————————————————————————————————————————————————————————————————————————————–</w:t>
-      </w:r>
-    </w:p>
-    <w:p>
-      <w:pPr>
-        <w:numPr>
-          <w:ilvl w:val="0"/>
-          <w:numId w:val="1036"/>
-        </w:numPr>
-      </w:pPr>
-      <w:r>
-        <w:t xml:space="preserve">Criar uma empresa fictícia com dois produtos, um serviço de nuvem, uma força de trabalho remota, e três fornecedores.</w:t>
-      </w:r>
-    </w:p>
-    <w:p>
-      <w:pPr>
-        <w:numPr>
-          <w:ilvl w:val="0"/>
-          <w:numId w:val="1036"/>
-        </w:numPr>
-      </w:pPr>
-      <w:r>
-        <w:t xml:space="preserve">Escreva uma análise de contexto de uma página, registro do partido interessado, determinação da relevância do clima e declaração do escopo.</w:t>
-      </w:r>
-    </w:p>
-    <w:p>
-      <w:pPr>
-        <w:numPr>
-          <w:ilvl w:val="0"/>
-          <w:numId w:val="1036"/>
-        </w:numPr>
-      </w:pPr>
-      <w:r>
-        <w:t xml:space="preserve">Criar critérios de risco e um registro de risco de dez cenários com proprietários e decisões de tratamento.</w:t>
-      </w:r>
-    </w:p>
-    <w:p>
-      <w:pPr>
-        <w:numPr>
-          <w:ilvl w:val="0"/>
-          <w:numId w:val="1036"/>
-        </w:numPr>
-      </w:pPr>
-      <w:r>
-        <w:t xml:space="preserve">Criar um plano de tratamento e SoA que aborda todos os 93 controles Anexo A com justificativas concisas e estado de implementação honesto.</w:t>
-      </w:r>
-    </w:p>
-    <w:p>
-      <w:pPr>
-        <w:numPr>
-          <w:ilvl w:val="0"/>
-          <w:numId w:val="1036"/>
-        </w:numPr>
-      </w:pPr>
-      <w:r>
-        <w:t xml:space="preserve">Construa políticas de amostragem, procedimentos, objetivos, métricas, registros de ativos e fornecedores, registro de treinamento, registro de incidentes e exercício de continuidade.</w:t>
-      </w:r>
-    </w:p>
-    <w:p>
-      <w:pPr>
-        <w:numPr>
-          <w:ilvl w:val="0"/>
-          <w:numId w:val="1036"/>
-        </w:numPr>
-      </w:pPr>
-      <w:r>
-        <w:t xml:space="preserve">Use algumas ferramentas de código aberto em laboratórios isolados e capturar escopo, configuração, resultados, validação, remediação e evidências de reteste.</w:t>
-      </w:r>
-    </w:p>
-    <w:p>
-      <w:pPr>
-        <w:numPr>
-          <w:ilvl w:val="0"/>
-          <w:numId w:val="1036"/>
-        </w:numPr>
-      </w:pPr>
-      <w:r>
-        <w:t xml:space="preserve">Projete e execute um plano de auditoria interna contra cláusulas e controles selecionados.</w:t>
-      </w:r>
-    </w:p>
-    <w:p>
-      <w:pPr>
-        <w:numPr>
-          <w:ilvl w:val="0"/>
-          <w:numId w:val="1036"/>
-        </w:numPr>
-      </w:pPr>
-      <w:r>
-        <w:t xml:space="preserve">Escreva duas não conformidades, registros de causa raiz, ações corretivas e testes de eficácia.</w:t>
-      </w:r>
-    </w:p>
-    <w:p>
-      <w:pPr>
-        <w:numPr>
-          <w:ilvl w:val="0"/>
-          <w:numId w:val="1036"/>
-        </w:numPr>
-      </w:pPr>
-      <w:r>
-        <w:t xml:space="preserve">Crie minutos de gerenciamento-revisão mostrando entradas, decisões, proprietários, recursos e prazos.</w:t>
-      </w:r>
-    </w:p>
-    <w:p>
-      <w:pPr>
-        <w:numPr>
-          <w:ilvl w:val="0"/>
-          <w:numId w:val="1036"/>
-        </w:numPr>
-      </w:pPr>
-      <w:r>
-        <w:t xml:space="preserve">Publique somente artefatos sintéticos e higienizados, com uma declaração clara de limitações.</w:t>
-      </w:r>
-    </w:p>
-    <w:p>
-      <w:pPr>
-        <w:pStyle w:val="FirstParagraph"/>
-      </w:pPr>
-      <w:r>
-        <w:t xml:space="preserve">O artefato de Portfólio** O que demonstra**</w:t>
-      </w:r>
-      <w:r>
-        <w:t xml:space="preserve"> </w:t>
-      </w:r>
-      <w:r>
-        <w:t xml:space="preserve">□——————————————————————————————————————</w:t>
-      </w:r>
-      <w:r>
-        <w:t xml:space="preserve"> </w:t>
-      </w:r>
-      <w:r>
-        <w:t xml:space="preserve">Contexto, partidos, escopo . Cláusula 4 raciocínio e limites .</w:t>
-      </w:r>
-      <w:r>
-        <w:t xml:space="preserve"> </w:t>
-      </w:r>
-      <w:r>
-        <w:t xml:space="preserve">• Método de risco, registo, tratamento</w:t>
-      </w:r>
-      <w:r>
-        <w:t xml:space="preserve"> </w:t>
-      </w:r>
-      <w:r>
-        <w:t xml:space="preserve">□ Declaração de aplicabilidade</w:t>
-      </w:r>
-      <w:r>
-        <w:t xml:space="preserve"> </w:t>
-      </w:r>
-      <w:r>
-        <w:t xml:space="preserve">□ Controle papel de teste □ Evidência, amostragem, exceção e conclusão</w:t>
-      </w:r>
-      <w:r>
-        <w:t xml:space="preserve"> </w:t>
-      </w:r>
-      <w:r>
-        <w:t xml:space="preserve">Programa, plano, critérios, relatório e acompanhamento</w:t>
-      </w:r>
-      <w:r>
-        <w:t xml:space="preserve"> </w:t>
-      </w:r>
-      <w:r>
-        <w:t xml:space="preserve">□ Minutos de análise de gestão</w:t>
-      </w:r>
-      <w:r>
-        <w:t xml:space="preserve"> </w:t>
-      </w:r>
-      <w:r>
-        <w:t xml:space="preserve">• Registo de acção correctiva</w:t>
-      </w:r>
-      <w:r>
-        <w:t xml:space="preserve"> </w:t>
-      </w:r>
-      <w:r>
-        <w:t xml:space="preserve">O Memorando de evidência da ferramenta O Alfabetismo técnico e limitações</w:t>
-      </w:r>
-    </w:p>
-    <w:bookmarkEnd w:id="104"/>
-    <w:bookmarkStart w:id="106" w:name="plano-de-aprendizagem-de-trinta-dias"/>
+        <w:t xml:space="preserve">• Anexo A • Conjunto de referência de 93 controlos de segurança da informação em ISO/IEC 27001:2022.</w:t>
+      </w:r>
+      <w:r>
+        <w:t xml:space="preserve"> </w:t>
+      </w:r>
+      <w:r>
+        <w:t xml:space="preserve">. CIA . . Confidencialidade, integridade e disponibilidade.</w:t>
+      </w:r>
+      <w:r>
+        <w:t xml:space="preserve"> </w:t>
+      </w:r>
+      <w:r>
+        <w:t xml:space="preserve">O cumprimento de uma exigência.</w:t>
+      </w:r>
+      <w:r>
+        <w:t xml:space="preserve"> </w:t>
+      </w:r>
+      <w:r>
+        <w:t xml:space="preserve">□ Controle □ Medida que modifica ou mantém o risco.</w:t>
+      </w:r>
+      <w:r>
+        <w:t xml:space="preserve"> </w:t>
+      </w:r>
+      <w:r>
+        <w:t xml:space="preserve">- Acção correctiva - Acção que aborda a causa de uma não conformidade para prevenir a recorrência.</w:t>
+      </w:r>
+      <w:r>
+        <w:t xml:space="preserve"> </w:t>
+      </w:r>
+      <w:r>
+        <w:t xml:space="preserve">Informações documentadas A organização deve controlar e manter ou reter.</w:t>
+      </w:r>
+      <w:r>
+        <w:t xml:space="preserve"> </w:t>
+      </w:r>
+      <w:r>
+        <w:t xml:space="preserve">□ Parte interessada; Pessoa ou organização que pode afetar, ser afetada ou perceber-se afetada por uma decisão ou atividade. □</w:t>
+      </w:r>
+      <w:r>
+        <w:t xml:space="preserve"> </w:t>
+      </w:r>
+      <w:r>
+        <w:t xml:space="preserve">Sistema de gestão da segurança da informação.</w:t>
+      </w:r>
+      <w:r>
+        <w:t xml:space="preserve"> </w:t>
+      </w:r>
+      <w:r>
+        <w:t xml:space="preserve">Não-conformidade Não-conformidade</w:t>
+      </w:r>
+      <w:r>
+        <w:t xml:space="preserve"> </w:t>
+      </w:r>
+      <w:r>
+        <w:t xml:space="preserve">Risco residual . Risco remanescente após o tratamento.</w:t>
+      </w:r>
+      <w:r>
+        <w:t xml:space="preserve"> </w:t>
+      </w:r>
+      <w:r>
+        <w:t xml:space="preserve">O proprietário do risco é uma pessoa ou entidade responsável e autorizada a gerir um risco.</w:t>
+      </w:r>
+      <w:r>
+        <w:t xml:space="preserve"> </w:t>
+      </w:r>
+      <w:r>
+        <w:t xml:space="preserve">(SoA ) Declaração de Aplicabilidade.</w:t>
+      </w:r>
+      <w:r>
+        <w:t xml:space="preserve"> </w:t>
+      </w:r>
+      <w:r>
+        <w:t xml:space="preserve">Gestão de topo □ Pessoa ou grupo que dirige e controla a organização no mais alto nível dentro do escopo.</w:t>
+      </w:r>
+    </w:p>
+    <w:bookmarkEnd w:id="149"/>
+    <w:bookmarkEnd w:id="150"/>
+    <w:bookmarkStart w:id="152" w:name="índice-de-assuntos"/>
     <w:p>
       <w:pPr>
         <w:pStyle w:val="Heading1"/>
       </w:pPr>
       <w:r>
-        <w:t xml:space="preserve">26. Plano de Aprendizagem de Trinta Dias</w:t>
-      </w:r>
-    </w:p>
-    <w:p>
-      <w:pPr>
-        <w:numPr>
-          <w:ilvl w:val="0"/>
-          <w:numId w:val="1037"/>
-        </w:numPr>
-      </w:pPr>
-      <w:r>
-        <w:t xml:space="preserve">Uma programação focada para a construção de capacidade de nível júnior útil.*</w:t>
-      </w:r>
-    </w:p>
-    <w:p>
-      <w:pPr>
-        <w:numPr>
-          <w:ilvl w:val="0"/>
-          <w:numId w:val="1037"/>
-        </w:numPr>
-        <w:pStyle w:val="Heading2"/>
-      </w:pPr>
-      <w:bookmarkStart w:id="105" w:name="dias-foco-entrega"/>
-      <w:r>
-        <w:t xml:space="preserve">Dias** * Foco** * Entrega**</w:t>
-      </w:r>
-      <w:bookmarkEnd w:id="105"/>
-    </w:p>
-    <w:p>
-      <w:pPr>
-        <w:numPr>
-          <w:ilvl w:val="0"/>
-          <w:numId w:val="1000"/>
-        </w:numPr>
-      </w:pPr>
-      <w:r>
-        <w:t xml:space="preserve">1–5 ISMS, CIA, cláusulas, ISO 27001/27002 relação, âmbito de aplicação</w:t>
-      </w:r>
-      <w:r>
-        <w:t xml:space="preserve"> </w:t>
-      </w:r>
-      <w:r>
-        <w:t xml:space="preserve">• 6–10 • Critérios de risco, cenários, avaliação, tratamento, aceitação</w:t>
-      </w:r>
-      <w:r>
-        <w:t xml:space="preserve"> </w:t>
-      </w:r>
-      <w:r>
-        <w:t xml:space="preserve">Os temas do Anexo A e a Declaração de Aplicabilidade</w:t>
-      </w:r>
-      <w:r>
-        <w:t xml:space="preserve"> </w:t>
-      </w:r>
-      <w:r>
-        <w:t xml:space="preserve">15–18 Políticas, competência, comunicação, controle de documentos, operações</w:t>
-      </w:r>
-      <w:r>
-        <w:t xml:space="preserve"> </w:t>
-      </w:r>
-      <w:r>
-        <w:t xml:space="preserve">□ 19–22 □ Métricas, monitorização, auditoria interna, revisão da gestão</w:t>
-      </w:r>
-      <w:r>
-        <w:t xml:space="preserve"> </w:t>
-      </w:r>
-      <w:r>
-        <w:t xml:space="preserve">23–25; Não conformidade, causa raiz, ação corretiva, melhoria; Dois registros de achados e ação corretiva;</w:t>
-      </w:r>
-      <w:r>
-        <w:t xml:space="preserve"> </w:t>
-      </w:r>
-      <w:r>
-        <w:t xml:space="preserve">26–28 Laboratórios de ferramentas de código aberto autorizados Dois memorandos de evidência e reteste</w:t>
-      </w:r>
-      <w:r>
-        <w:t xml:space="preserve"> </w:t>
-      </w:r>
-      <w:r>
-        <w:t xml:space="preserve">29–30 □ Limpeza e prática de entrevista de carteiras</w:t>
-      </w:r>
-    </w:p>
-    <w:bookmarkEnd w:id="106"/>
-    <w:bookmarkStart w:id="108" w:name="preparação-da-entrevista"/>
-    <w:p>
-      <w:pPr>
-        <w:pStyle w:val="Heading1"/>
-      </w:pPr>
-      <w:r>
-        <w:t xml:space="preserve">27. Preparação da entrevista</w:t>
-      </w:r>
-    </w:p>
-    <w:p>
-      <w:pPr>
-        <w:numPr>
-          <w:ilvl w:val="0"/>
-          <w:numId w:val="1038"/>
-        </w:numPr>
-        <w:pStyle w:val="Compact"/>
-      </w:pPr>
-      <w:r>
-        <w:t xml:space="preserve">Respostas claras, cenários práticos e perguntas para o empregador.*</w:t>
-      </w:r>
-    </w:p>
-    <w:bookmarkStart w:id="107" w:name="o-que-é-um-isms"/>
-    <w:p>
-      <w:pPr>
-        <w:pStyle w:val="Heading2"/>
-      </w:pPr>
-      <w:r>
-        <w:t xml:space="preserve">27.1 O que é um ISMS?</w:t>
-      </w:r>
-    </w:p>
-    <w:p>
-      <w:pPr>
-        <w:pStyle w:val="FirstParagraph"/>
-      </w:pPr>
-      <w:r>
-        <w:t xml:space="preserve">Um sistema de gestão para controlar o risco de segurança da informação através de liderança, planejamento, operação, avaliação e melhoria contínua.</w:t>
-      </w:r>
-    </w:p>
-    <w:bookmarkEnd w:id="107"/>
-    <w:bookmarkEnd w:id="108"/>
-    <w:bookmarkStart w:id="109" w:name="iso-27001-versus-27002"/>
-    <w:p>
-      <w:pPr>
-        <w:pStyle w:val="Heading1"/>
-      </w:pPr>
-      <w:r>
-        <w:t xml:space="preserve"># 27,2 ISO 27001 versus 27002?</w:t>
-      </w:r>
-    </w:p>
-    <w:p>
-      <w:pPr>
-        <w:pStyle w:val="FirstParagraph"/>
-      </w:pPr>
-      <w:r>
-        <w:t xml:space="preserve">27001 contém requisitos ISMS certificados; 27002 fornece orientação de controle detalhada e não é em si uma norma de certificação.</w:t>
-      </w:r>
-    </w:p>
-    <w:bookmarkEnd w:id="109"/>
-    <w:bookmarkStart w:id="111" w:name="o-que-é-o-soa"/>
-    <w:p>
-      <w:pPr>
-        <w:pStyle w:val="Heading1"/>
-      </w:pPr>
-      <w:r>
-        <w:t xml:space="preserve"># 27.3 O que é o SoA?</w:t>
-      </w:r>
-    </w:p>
-    <w:p>
-      <w:pPr>
-        <w:pStyle w:val="FirstParagraph"/>
-      </w:pPr>
-      <w:r>
-        <w:t xml:space="preserve">Um registo controlado dos controlos necessários, a justificação da inclusão ou exclusão no anexo A e o estado de execução, ligados ao tratamento e às provas.</w:t>
-      </w:r>
-    </w:p>
-    <w:bookmarkStart w:id="110" w:name="Xd7a94282af627341903619724c786ba476635e4"/>
-    <w:p>
-      <w:pPr>
-        <w:pStyle w:val="Heading2"/>
-      </w:pPr>
-      <w:r>
-        <w:t xml:space="preserve">27.4 Todos os controles do Anexo A são obrigatórios?</w:t>
-      </w:r>
-    </w:p>
-    <w:p>
-      <w:pPr>
-        <w:pStyle w:val="FirstParagraph"/>
-      </w:pPr>
-      <w:r>
-        <w:t xml:space="preserve">A organização deve utilizar o anexo A como verificação de referência e justificar as decisões. Controles necessários seguem tratamento de risco e obrigações; outros controles também podem ser necessários.</w:t>
-      </w:r>
-    </w:p>
-    <w:bookmarkEnd w:id="110"/>
-    <w:bookmarkEnd w:id="111"/>
-    <w:bookmarkStart w:id="112" w:name="como-se-testa-um-controle"/>
-    <w:p>
-      <w:pPr>
-        <w:pStyle w:val="Heading1"/>
-      </w:pPr>
-      <w:r>
-        <w:t xml:space="preserve"># 27.5 Como se testa um controle?</w:t>
-      </w:r>
-    </w:p>
-    <w:p>
-      <w:pPr>
-        <w:pStyle w:val="FirstParagraph"/>
-      </w:pPr>
-      <w:r>
-        <w:t xml:space="preserve">Defina critérios e escopo, valide a população, amostra por risco, inspecione e reperforme evidências, exceções documentais e correção de reteste.</w:t>
-      </w:r>
-    </w:p>
-    <w:bookmarkEnd w:id="112"/>
-    <w:bookmarkStart w:id="113" w:name="o-que-é-uma-não-conformidade"/>
-    <w:p>
-      <w:pPr>
-        <w:pStyle w:val="Heading1"/>
-      </w:pPr>
-      <w:r>
-        <w:t xml:space="preserve"># 27.6 O que é uma não conformidade?</w:t>
-      </w:r>
-    </w:p>
-    <w:p>
-      <w:pPr>
-        <w:pStyle w:val="FirstParagraph"/>
-      </w:pPr>
-      <w:r>
-        <w:t xml:space="preserve">Falha em cumprir uma exigência. Requer correção, avaliação, ação adequada e revisão de efetividade.</w:t>
-      </w:r>
-    </w:p>
-    <w:bookmarkEnd w:id="113"/>
-    <w:bookmarkStart w:id="114" w:name="o-que-mudou-em-2024"/>
-    <w:p>
-      <w:pPr>
-        <w:pStyle w:val="Heading1"/>
-      </w:pPr>
-      <w:r>
-        <w:t xml:space="preserve"># 27.7 O que mudou em 2024?</w:t>
-      </w:r>
-    </w:p>
-    <w:p>
-      <w:pPr>
-        <w:pStyle w:val="FirstParagraph"/>
-      </w:pPr>
-      <w:r>
-        <w:t xml:space="preserve">A alteração exige uma consideração explícita da relevância das alterações climáticas no contexto e observa que as partes interessadas podem ter requisitos relacionados com o clima.</w:t>
-      </w:r>
-    </w:p>
-    <w:bookmarkEnd w:id="114"/>
-    <w:bookmarkStart w:id="115" w:name="X6af7a3d625a0b1807a794f98499926755a55a0d"/>
-    <w:p>
-      <w:pPr>
-        <w:pStyle w:val="Heading1"/>
-      </w:pPr>
-      <w:r>
-        <w:t xml:space="preserve"># 27.8 O que pode um analista júnior concluir com segurança?</w:t>
-      </w:r>
-    </w:p>
-    <w:p>
-      <w:pPr>
-        <w:pStyle w:val="FirstParagraph"/>
-      </w:pPr>
-      <w:r>
-        <w:t xml:space="preserve">Factos estatais apoiados por elementos de prova e âmbito definidos, divulgar limitações e evitar reclamar a autoridade de auditoria ou certificação.</w:t>
-      </w:r>
-    </w:p>
-    <w:bookmarkEnd w:id="115"/>
-    <w:bookmarkStart w:id="116" w:name="perguntas-para-perguntar-ao-empregador"/>
-    <w:p>
-      <w:pPr>
-        <w:pStyle w:val="Heading1"/>
-      </w:pPr>
-      <w:r>
-        <w:t xml:space="preserve"># 27.9 Perguntas para perguntar ao empregador</w:t>
-      </w:r>
-    </w:p>
-    <w:p>
-      <w:pPr>
-        <w:numPr>
-          <w:ilvl w:val="0"/>
-          <w:numId w:val="1039"/>
-        </w:numPr>
-      </w:pPr>
-      <w:r>
-        <w:t xml:space="preserve">Qual é o escopo ISMS certificado ou pretendido?</w:t>
-      </w:r>
-    </w:p>
-    <w:p>
-      <w:pPr>
-        <w:numPr>
-          <w:ilvl w:val="0"/>
-          <w:numId w:val="1039"/>
-        </w:numPr>
-      </w:pPr>
-      <w:r>
-        <w:t xml:space="preserve">Quem é o dono da aceitação do risco e do SoA?</w:t>
-      </w:r>
-    </w:p>
-    <w:p>
-      <w:pPr>
-        <w:numPr>
-          <w:ilvl w:val="0"/>
-          <w:numId w:val="1039"/>
-        </w:numPr>
-      </w:pPr>
-      <w:r>
-        <w:t xml:space="preserve">Como as populações de evidência são produzidas e validadas?</w:t>
-      </w:r>
-    </w:p>
-    <w:p>
-      <w:pPr>
-        <w:numPr>
-          <w:ilvl w:val="0"/>
-          <w:numId w:val="1039"/>
-        </w:numPr>
-      </w:pPr>
-      <w:r>
-        <w:t xml:space="preserve">Que sistemas gerem riscos, controlos, fornecedores, resultados e medidas correctivas?</w:t>
-      </w:r>
-    </w:p>
-    <w:p>
-      <w:pPr>
-        <w:numPr>
-          <w:ilvl w:val="0"/>
-          <w:numId w:val="1039"/>
-        </w:numPr>
-      </w:pPr>
-      <w:r>
-        <w:t xml:space="preserve">Como é mantida a independência do auditor interno?</w:t>
-      </w:r>
-    </w:p>
-    <w:p>
-      <w:pPr>
-        <w:numPr>
-          <w:ilvl w:val="0"/>
-          <w:numId w:val="1039"/>
-        </w:numPr>
-      </w:pPr>
-      <w:r>
-        <w:t xml:space="preserve">Com que equipas técnicas trabalhará este papel?</w:t>
-      </w:r>
-    </w:p>
-    <w:p>
-      <w:pPr>
-        <w:numPr>
-          <w:ilvl w:val="0"/>
-          <w:numId w:val="1039"/>
-        </w:numPr>
-      </w:pPr>
-      <w:r>
-        <w:t xml:space="preserve">Como as conclusões júnior são revistas e treinadas?</w:t>
-      </w:r>
-    </w:p>
-    <w:bookmarkEnd w:id="116"/>
-    <w:bookmarkStart w:id="117" w:name="modelos-glossário-índice-e-referências"/>
-    <w:p>
-      <w:pPr>
-        <w:pStyle w:val="Heading1"/>
-      </w:pPr>
-      <w:r>
-        <w:t xml:space="preserve">28. Modelos, Glossário, Índice e Referências</w:t>
-      </w:r>
-    </w:p>
-    <w:p>
-      <w:pPr>
-        <w:numPr>
-          <w:ilvl w:val="0"/>
-          <w:numId w:val="1040"/>
-        </w:numPr>
-        <w:pStyle w:val="Compact"/>
-      </w:pPr>
-      <w:r>
-        <w:t xml:space="preserve">Estruturas de trabalho reutilizáveis, termos importantes e pontos de partida autoritários.*</w:t>
-      </w:r>
-    </w:p>
-    <w:bookmarkEnd w:id="117"/>
-    <w:bookmarkStart w:id="119" w:name="registro-de-risco-mínimo"/>
-    <w:p>
-      <w:pPr>
-        <w:pStyle w:val="Heading1"/>
-      </w:pPr>
-      <w:r>
-        <w:t xml:space="preserve"># 28.1 Registro de risco mínimo</w:t>
-      </w:r>
-    </w:p>
-    <w:p>
-      <w:pPr>
-        <w:numPr>
-          <w:ilvl w:val="0"/>
-          <w:numId w:val="1041"/>
-        </w:numPr>
-        <w:pStyle w:val="Heading2"/>
-      </w:pPr>
-      <w:bookmarkStart w:id="118" w:name="campo-entrada"/>
-      <w:r>
-        <w:t xml:space="preserve">Campo** * Entrada**</w:t>
-      </w:r>
-      <w:bookmarkEnd w:id="118"/>
-    </w:p>
-    <w:p>
-      <w:pPr>
-        <w:numPr>
-          <w:ilvl w:val="0"/>
-          <w:numId w:val="1000"/>
-        </w:numPr>
-        <w:pStyle w:val="Compact"/>
-      </w:pPr>
-      <w:r>
-        <w:t xml:space="preserve">ID de risco e proprietário</w:t>
-      </w:r>
-      <w:r>
-        <w:t xml:space="preserve"> </w:t>
-      </w:r>
-      <w:r>
-        <w:t xml:space="preserve">Objectivo / activo</w:t>
-      </w:r>
-      <w:r>
-        <w:t xml:space="preserve"> </w:t>
-      </w:r>
-      <w:r>
-        <w:t xml:space="preserve">“</w:t>
-      </w:r>
-      <w:r>
-        <w:t xml:space="preserve">Evento e condição de ameaça</w:t>
-      </w:r>
-      <w:r>
-        <w:t xml:space="preserve">”</w:t>
-      </w:r>
-      <w:r>
-        <w:t xml:space="preserve"> </w:t>
-      </w:r>
-      <w:r>
-        <w:t xml:space="preserve">Consequências</w:t>
-      </w:r>
-      <w:r>
-        <w:t xml:space="preserve"> </w:t>
-      </w:r>
-      <w:r>
-        <w:t xml:space="preserve">Controlos existentes</w:t>
-      </w:r>
-    </w:p>
-    <w:p>
-      <w:pPr>
-        <w:numPr>
-          <w:ilvl w:val="0"/>
-          <w:numId w:val="1041"/>
-        </w:numPr>
-        <w:pStyle w:val="Compact"/>
-      </w:pPr>
-      <w:r>
-        <w:t xml:space="preserve">Litígio e impacto</w:t>
-      </w:r>
-      <w:r>
-        <w:t xml:space="preserve"> </w:t>
-      </w:r>
-      <w:r>
-        <w:t xml:space="preserve">O risco actual</w:t>
-      </w:r>
-      <w:r>
-        <w:t xml:space="preserve"> </w:t>
-      </w:r>
-      <w:r>
-        <w:t xml:space="preserve">O titular do tratamento e da acção □                                 </w:t>
-      </w:r>
-      <w:r>
-        <w:t xml:space="preserve"> </w:t>
-      </w:r>
-      <w:r>
-        <w:t xml:space="preserve">Risco residual e aceitação</w:t>
-      </w:r>
-      <w:r>
-        <w:t xml:space="preserve"> </w:t>
-      </w:r>
-      <w:r>
-        <w:t xml:space="preserve">Data de revisão</w:t>
-      </w:r>
-    </w:p>
-    <w:bookmarkEnd w:id="119"/>
-    <w:bookmarkStart w:id="121" w:name="papel-de-teste-de-controle"/>
-    <w:p>
-      <w:pPr>
-        <w:pStyle w:val="Heading1"/>
-      </w:pPr>
-      <w:r>
-        <w:t xml:space="preserve"># 28.2 Papel de teste de controle</w:t>
-      </w:r>
-    </w:p>
-    <w:p>
-      <w:pPr>
-        <w:numPr>
-          <w:ilvl w:val="0"/>
-          <w:numId w:val="1042"/>
-        </w:numPr>
-        <w:pStyle w:val="Heading2"/>
-      </w:pPr>
-      <w:bookmarkStart w:id="120" w:name="campo-entrada-1"/>
-      <w:r>
-        <w:t xml:space="preserve">Campo** * Entrada**</w:t>
-      </w:r>
-      <w:bookmarkEnd w:id="120"/>
-    </w:p>
-    <w:p>
-      <w:pPr>
-        <w:numPr>
-          <w:ilvl w:val="0"/>
-          <w:numId w:val="1000"/>
-        </w:numPr>
-        <w:pStyle w:val="Compact"/>
-      </w:pPr>
-      <w:r>
-        <w:t xml:space="preserve">• Critérios e controlo</w:t>
-      </w:r>
-      <w:r>
-        <w:t xml:space="preserve"> </w:t>
-      </w:r>
-      <w:r>
-        <w:t xml:space="preserve">Âmbito de aplicação e período</w:t>
-      </w:r>
-      <w:r>
-        <w:t xml:space="preserve"> </w:t>
-      </w:r>
-      <w:r>
-        <w:t xml:space="preserve">• Proprietário e sistemas</w:t>
-      </w:r>
-      <w:r>
-        <w:t xml:space="preserve"> </w:t>
-      </w:r>
-      <w:r>
-        <w:t xml:space="preserve">• Verificação da população e da completude</w:t>
-      </w:r>
-      <w:r>
-        <w:t xml:space="preserve"> </w:t>
-      </w:r>
-      <w:r>
-        <w:t xml:space="preserve">Exemplo e justificação</w:t>
-      </w:r>
-      <w:r>
-        <w:t xml:space="preserve"> </w:t>
-      </w:r>
-      <w:r>
-        <w:t xml:space="preserve">Procedimento realizado</w:t>
-      </w:r>
-      <w:r>
-        <w:t xml:space="preserve"> </w:t>
-      </w:r>
-      <w:r>
-        <w:t xml:space="preserve">• Provas inspeccionadas</w:t>
-      </w:r>
-      <w:r>
-        <w:t xml:space="preserve"> </w:t>
-      </w:r>
-      <w:r>
-        <w:t xml:space="preserve">Excepções</w:t>
-      </w:r>
-      <w:r>
-        <w:t xml:space="preserve"> </w:t>
-      </w:r>
-      <w:r>
-        <w:t xml:space="preserve">Conclusão e limitação</w:t>
-      </w:r>
-    </w:p>
-    <w:p>
-      <w:pPr>
-        <w:numPr>
-          <w:ilvl w:val="0"/>
-          <w:numId w:val="1042"/>
-        </w:numPr>
-        <w:pStyle w:val="Compact"/>
-      </w:pPr>
-      <w:r>
-        <w:t xml:space="preserve">Correcção e reteste</w:t>
-      </w:r>
-    </w:p>
-    <w:bookmarkEnd w:id="121"/>
-    <w:bookmarkStart w:id="123" w:name="glossário"/>
-    <w:p>
-      <w:pPr>
-        <w:pStyle w:val="Heading1"/>
-      </w:pPr>
-      <w:r>
-        <w:t xml:space="preserve"># 28.3 Glossário</w:t>
-      </w:r>
-    </w:p>
-    <w:bookmarkStart w:id="122" w:name="section-2"/>
-    <w:p>
-      <w:pPr>
-        <w:pStyle w:val="Heading2"/>
-      </w:pPr>
-      <w:r>
-        <w:t xml:space="preserve">* ** ** ** ** ** ** **</w:t>
-      </w:r>
-    </w:p>
-    <w:p>
-      <w:pPr>
-        <w:pStyle w:val="FirstParagraph"/>
-      </w:pPr>
-      <w:r>
-        <w:t xml:space="preserve">• Anexo A • Conjunto de referência de 93 controlos de segurança da informação em ISO/IEC 27001:2022.</w:t>
-      </w:r>
-      <w:r>
-        <w:t xml:space="preserve"> </w:t>
-      </w:r>
-      <w:r>
-        <w:t xml:space="preserve">. CIA . . Confidencialidade, integridade e disponibilidade.</w:t>
-      </w:r>
-      <w:r>
-        <w:t xml:space="preserve"> </w:t>
-      </w:r>
-      <w:r>
-        <w:t xml:space="preserve">O cumprimento de uma exigência.</w:t>
-      </w:r>
-      <w:r>
-        <w:t xml:space="preserve"> </w:t>
-      </w:r>
-      <w:r>
-        <w:t xml:space="preserve">□ Controle □ Medida que modifica ou mantém o risco.</w:t>
-      </w:r>
-      <w:r>
-        <w:t xml:space="preserve"> </w:t>
-      </w:r>
-      <w:r>
-        <w:t xml:space="preserve">- Acção correctiva - Acção que aborda a causa de uma não conformidade para prevenir a recorrência.</w:t>
-      </w:r>
-      <w:r>
-        <w:t xml:space="preserve"> </w:t>
-      </w:r>
-      <w:r>
-        <w:t xml:space="preserve">Informações documentadas A organização deve controlar e manter ou reter.</w:t>
-      </w:r>
-      <w:r>
-        <w:t xml:space="preserve"> </w:t>
-      </w:r>
-      <w:r>
-        <w:t xml:space="preserve">□ Parte interessada; Pessoa ou organização que pode afetar, ser afetada ou perceber-se afetada por uma decisão ou atividade. □</w:t>
-      </w:r>
-      <w:r>
-        <w:t xml:space="preserve"> </w:t>
-      </w:r>
-      <w:r>
-        <w:t xml:space="preserve">Sistema de gestão da segurança da informação.</w:t>
-      </w:r>
-      <w:r>
-        <w:t xml:space="preserve"> </w:t>
-      </w:r>
-      <w:r>
-        <w:t xml:space="preserve">Não-conformidade Não-conformidade</w:t>
-      </w:r>
-      <w:r>
-        <w:t xml:space="preserve"> </w:t>
-      </w:r>
-      <w:r>
-        <w:t xml:space="preserve">Risco residual . Risco remanescente após o tratamento.</w:t>
-      </w:r>
-      <w:r>
-        <w:t xml:space="preserve"> </w:t>
-      </w:r>
-      <w:r>
-        <w:t xml:space="preserve">O proprietário do risco é uma pessoa ou entidade responsável e autorizada a gerir um risco.</w:t>
-      </w:r>
-      <w:r>
-        <w:t xml:space="preserve"> </w:t>
-      </w:r>
-      <w:r>
-        <w:t xml:space="preserve">(SoA ) Declaração de Aplicabilidade.</w:t>
-      </w:r>
-      <w:r>
-        <w:t xml:space="preserve"> </w:t>
-      </w:r>
-      <w:r>
-        <w:t xml:space="preserve">Gestão de topo □ Pessoa ou grupo que dirige e controla a organização no mais alto nível dentro do escopo.</w:t>
-      </w:r>
-    </w:p>
-    <w:bookmarkEnd w:id="122"/>
-    <w:bookmarkEnd w:id="123"/>
-    <w:bookmarkStart w:id="125" w:name="índice-de-assuntos"/>
-    <w:p>
-      <w:pPr>
-        <w:pStyle w:val="Heading1"/>
-      </w:pPr>
-      <w:r>
         <w:t xml:space="preserve"># 28.4 Índice de assuntos</w:t>
       </w:r>
     </w:p>
-    <w:bookmarkStart w:id="124" w:name="sujeito-capítulo"/>
+    <w:bookmarkStart w:id="151" w:name="sujeito-capítulo"/>
     <w:p>
       <w:pPr>
         <w:pStyle w:val="Heading2"/>
@@ -6302,9 +6726,9 @@
         <w:t xml:space="preserve">Fornecedores 13, 18, 23</w:t>
       </w:r>
     </w:p>
-    <w:bookmarkEnd w:id="124"/>
-    <w:bookmarkEnd w:id="125"/>
-    <w:bookmarkStart w:id="132" w:name="referências-oficiais"/>
+    <w:bookmarkEnd w:id="151"/>
+    <w:bookmarkEnd w:id="152"/>
+    <w:bookmarkStart w:id="159" w:name="referências-oficiais"/>
     <w:p>
       <w:pPr>
         <w:pStyle w:val="Heading1"/>
@@ -6317,7 +6741,7 @@
       <w:pPr>
         <w:pStyle w:val="FirstParagraph"/>
       </w:pPr>
-      <w:hyperlink r:id="rId126">
+      <w:hyperlink r:id="rId153">
         <w:r>
           <w:rPr>
             <w:rStyle w:val="Hyperlink"/>
@@ -6330,7 +6754,7 @@
       <w:pPr>
         <w:pStyle w:val="BodyText"/>
       </w:pPr>
-      <w:hyperlink r:id="rId127">
+      <w:hyperlink r:id="rId154">
         <w:r>
           <w:rPr>
             <w:rStyle w:val="Hyperlink"/>
@@ -6343,7 +6767,7 @@
       <w:pPr>
         <w:pStyle w:val="BodyText"/>
       </w:pPr>
-      <w:hyperlink r:id="rId128">
+      <w:hyperlink r:id="rId155">
         <w:r>
           <w:rPr>
             <w:rStyle w:val="Hyperlink"/>
@@ -6356,7 +6780,7 @@
       <w:pPr>
         <w:pStyle w:val="BodyText"/>
       </w:pPr>
-      <w:hyperlink r:id="rId129">
+      <w:hyperlink r:id="rId156">
         <w:r>
           <w:rPr>
             <w:rStyle w:val="Hyperlink"/>
@@ -6369,7 +6793,7 @@
       <w:pPr>
         <w:pStyle w:val="BodyText"/>
       </w:pPr>
-      <w:hyperlink r:id="rId130">
+      <w:hyperlink r:id="rId157">
         <w:r>
           <w:rPr>
             <w:rStyle w:val="Hyperlink"/>
@@ -6382,7 +6806,7 @@
       <w:pPr>
         <w:pStyle w:val="BodyText"/>
       </w:pPr>
-      <w:hyperlink r:id="rId131">
+      <w:hyperlink r:id="rId158">
         <w:r>
           <w:rPr>
             <w:rStyle w:val="Hyperlink"/>
@@ -6415,7 +6839,7 @@
         <w:t xml:space="preserve">□————————————————————————————————————————————————————————————————————————————————————————————————————————————————–</w:t>
       </w:r>
     </w:p>
-    <w:bookmarkEnd w:id="132"/>
+    <w:bookmarkEnd w:id="159"/>
     <w:sectPr/>
   </w:body>
 </w:document>

</xml_diff>